<commit_message>
docs: screenshots from 1.3.2, client brand example
New README screenshots rendered with 1.3.2, plus a client brand example
(examples/brand.md, preset in examples/brands/) built by examples/build.py.

Co-Authored-By: Claude Opus 5.5 <noreply@anthropic.com>
</commit_message>
<xml_diff>
--- a/examples/demo_report.docx
+++ b/examples/demo_report.docx
@@ -28,8 +28,8 @@
             </w:tcBorders>
             <w:tcMar>
               <w:top w:w="0" w:type="dxa"/>
+              <w:left w:w="0" w:type="dxa"/>
               <w:bottom w:w="0" w:type="dxa"/>
-              <w:left w:w="0" w:type="dxa"/>
               <w:right w:w="0" w:type="dxa"/>
             </w:tcMar>
             <w:vAlign w:val="top"/>
@@ -42,13 +42,12 @@
               <w:tblLook w:firstColumn="1" w:firstRow="1" w:lastColumn="0" w:lastRow="0" w:noHBand="0" w:noVBand="1" w:val="04A0"/>
             </w:tblPr>
             <w:tblGrid>
-              <w:gridCol w:w="9184"/>
+              <w:gridCol w:w="9000"/>
             </w:tblGrid>
             <w:tr>
               <w:tc>
                 <w:tcPr>
                   <w:tcW w:type="dxa" w:w="9000"/>
-                  <w:shd w:val="clear" w:color="auto" w:fill="1B6B93"/>
                   <w:tcBorders>
                     <w:top w:val="nil"/>
                     <w:left w:val="nil"/>
@@ -57,10 +56,11 @@
                     <w:insideH w:val="nil"/>
                     <w:insideV w:val="nil"/>
                   </w:tcBorders>
+                  <w:shd w:val="clear" w:color="auto" w:fill="1B6B93"/>
                   <w:tcMar>
                     <w:top w:w="360" w:type="dxa"/>
+                    <w:left w:w="320" w:type="dxa"/>
                     <w:bottom w:w="360" w:type="dxa"/>
-                    <w:left w:w="320" w:type="dxa"/>
                     <w:right w:w="320" w:type="dxa"/>
                   </w:tcMar>
                 </w:tcPr>
@@ -113,8 +113,8 @@
             </w:tcBorders>
             <w:tcMar>
               <w:top w:w="0" w:type="dxa"/>
+              <w:left w:w="0" w:type="dxa"/>
               <w:bottom w:w="0" w:type="dxa"/>
-              <w:left w:w="0" w:type="dxa"/>
               <w:right w:w="0" w:type="dxa"/>
             </w:tcMar>
             <w:vAlign w:val="bottom"/>
@@ -186,11 +186,7 @@
         <w:t>digital transformation program</w:t>
       </w:r>
       <w:r>
-        <w:t xml:space="preserve"> for FY 2026–2028,</w:t>
-        <w:br/>
-        <w:t>with three goals: modernize the technical infrastructure, streamline operations,</w:t>
-        <w:br/>
-        <w:t>and embed AI into the decision-making workflow.</w:t>
+        <w:t xml:space="preserve"> for FY 2026–2028, with three goals: modernize the technical infrastructure, streamline operations, and embed AI into the decision-making workflow.</w:t>
       </w:r>
     </w:p>
     <w:tbl>
@@ -206,17 +202,17 @@
         <w:tc>
           <w:tcPr>
             <w:tcW w:type="dxa" w:w="9184"/>
-            <w:shd w:val="clear" w:color="auto" w:fill="EAF3FB"/>
             <w:tcBorders>
               <w:top w:val="single" w:sz="4" w:space="0" w:color="EAF3FB"/>
               <w:left w:val="single" w:sz="24" w:space="0" w:color="2E75B6"/>
               <w:bottom w:val="single" w:sz="4" w:space="0" w:color="EAF3FB"/>
               <w:right w:val="single" w:sz="4" w:space="0" w:color="EAF3FB"/>
             </w:tcBorders>
+            <w:shd w:val="clear" w:color="auto" w:fill="EAF3FB"/>
             <w:tcMar>
               <w:top w:w="140" w:type="dxa"/>
+              <w:left w:w="200" w:type="dxa"/>
               <w:bottom w:w="140" w:type="dxa"/>
-              <w:left w:w="200" w:type="dxa"/>
               <w:right w:w="200" w:type="dxa"/>
             </w:tcMar>
           </w:tcPr>
@@ -251,11 +247,7 @@
               <w:t>67% of companies</w:t>
             </w:r>
             <w:r>
-              <w:t xml:space="preserve"> in our sector have</w:t>
-              <w:br/>
-              <w:t>already started an advanced digitalization effort. Falling behind on AI adoption</w:t>
-              <w:br/>
-              <w:t xml:space="preserve">carries an estimated competitive risk of </w:t>
+              <w:t xml:space="preserve"> in our sector have already started an advanced digitalization effort. Falling behind on AI adoption carries an estimated competitive risk of </w:t>
             </w:r>
             <w:r>
               <w:rPr>
@@ -265,9 +257,7 @@
               <w:t>15–20 percentage points</w:t>
             </w:r>
             <w:r>
-              <w:t xml:space="preserve"> of</w:t>
-              <w:br/>
-              <w:t>operating margin.</w:t>
+              <w:t xml:space="preserve"> of operating margin.</w:t>
             </w:r>
           </w:p>
         </w:tc>
@@ -295,10 +285,10 @@
         <w:tblLook w:firstColumn="1" w:firstRow="1" w:lastColumn="0" w:lastRow="0" w:noHBand="0" w:noVBand="1" w:val="04A0"/>
       </w:tblPr>
       <w:tblGrid>
-        <w:gridCol w:w="2296"/>
-        <w:gridCol w:w="2296"/>
-        <w:gridCol w:w="2296"/>
-        <w:gridCol w:w="2296"/>
+        <w:gridCol w:w="3028"/>
+        <w:gridCol w:w="2840"/>
+        <w:gridCol w:w="1602"/>
+        <w:gridCol w:w="1714"/>
       </w:tblGrid>
       <w:tr>
         <w:trPr>
@@ -306,21 +296,21 @@
         </w:trPr>
         <w:tc>
           <w:tcPr>
-            <w:tcW w:type="dxa" w:w="2296"/>
-            <w:tcMar>
-              <w:top w:w="70" w:type="dxa"/>
-              <w:bottom w:w="70" w:type="dxa"/>
-              <w:left w:w="130" w:type="dxa"/>
-              <w:right w:w="130" w:type="dxa"/>
-            </w:tcMar>
-            <w:vAlign w:val="center"/>
-            <w:shd w:val="clear" w:color="auto" w:fill="1B6B93"/>
+            <w:tcW w:type="dxa" w:w="3028"/>
             <w:tcBorders>
               <w:top w:val="nil"/>
               <w:left w:val="nil"/>
               <w:bottom w:val="single" w:sz="12" w:space="0" w:color="1B6B93"/>
               <w:right w:val="nil"/>
             </w:tcBorders>
+            <w:shd w:val="clear" w:color="auto" w:fill="1B6B93"/>
+            <w:tcMar>
+              <w:top w:w="70" w:type="dxa"/>
+              <w:left w:w="130" w:type="dxa"/>
+              <w:bottom w:w="70" w:type="dxa"/>
+              <w:right w:w="130" w:type="dxa"/>
+            </w:tcMar>
+            <w:vAlign w:val="center"/>
           </w:tcPr>
           <w:p>
             <w:pPr>
@@ -340,21 +330,21 @@
         </w:tc>
         <w:tc>
           <w:tcPr>
-            <w:tcW w:type="dxa" w:w="2296"/>
-            <w:tcMar>
-              <w:top w:w="70" w:type="dxa"/>
-              <w:bottom w:w="70" w:type="dxa"/>
-              <w:left w:w="130" w:type="dxa"/>
-              <w:right w:w="130" w:type="dxa"/>
-            </w:tcMar>
-            <w:vAlign w:val="center"/>
-            <w:shd w:val="clear" w:color="auto" w:fill="1B6B93"/>
+            <w:tcW w:type="dxa" w:w="2840"/>
             <w:tcBorders>
               <w:top w:val="nil"/>
               <w:left w:val="nil"/>
               <w:bottom w:val="single" w:sz="12" w:space="0" w:color="1B6B93"/>
               <w:right w:val="nil"/>
             </w:tcBorders>
+            <w:shd w:val="clear" w:color="auto" w:fill="1B6B93"/>
+            <w:tcMar>
+              <w:top w:w="70" w:type="dxa"/>
+              <w:left w:w="130" w:type="dxa"/>
+              <w:bottom w:w="70" w:type="dxa"/>
+              <w:right w:w="130" w:type="dxa"/>
+            </w:tcMar>
+            <w:vAlign w:val="center"/>
           </w:tcPr>
           <w:p>
             <w:pPr>
@@ -374,21 +364,21 @@
         </w:tc>
         <w:tc>
           <w:tcPr>
-            <w:tcW w:type="dxa" w:w="2296"/>
-            <w:tcMar>
-              <w:top w:w="70" w:type="dxa"/>
-              <w:bottom w:w="70" w:type="dxa"/>
-              <w:left w:w="130" w:type="dxa"/>
-              <w:right w:w="130" w:type="dxa"/>
-            </w:tcMar>
-            <w:vAlign w:val="center"/>
-            <w:shd w:val="clear" w:color="auto" w:fill="1B6B93"/>
+            <w:tcW w:type="dxa" w:w="1602"/>
             <w:tcBorders>
               <w:top w:val="nil"/>
               <w:left w:val="nil"/>
               <w:bottom w:val="single" w:sz="12" w:space="0" w:color="1B6B93"/>
               <w:right w:val="nil"/>
             </w:tcBorders>
+            <w:shd w:val="clear" w:color="auto" w:fill="1B6B93"/>
+            <w:tcMar>
+              <w:top w:w="70" w:type="dxa"/>
+              <w:left w:w="130" w:type="dxa"/>
+              <w:bottom w:w="70" w:type="dxa"/>
+              <w:right w:w="130" w:type="dxa"/>
+            </w:tcMar>
+            <w:vAlign w:val="center"/>
           </w:tcPr>
           <w:p>
             <w:pPr>
@@ -408,21 +398,21 @@
         </w:tc>
         <w:tc>
           <w:tcPr>
-            <w:tcW w:type="dxa" w:w="2296"/>
-            <w:tcMar>
-              <w:top w:w="70" w:type="dxa"/>
-              <w:bottom w:w="70" w:type="dxa"/>
-              <w:left w:w="130" w:type="dxa"/>
-              <w:right w:w="130" w:type="dxa"/>
-            </w:tcMar>
-            <w:vAlign w:val="center"/>
-            <w:shd w:val="clear" w:color="auto" w:fill="1B6B93"/>
+            <w:tcW w:type="dxa" w:w="1714"/>
             <w:tcBorders>
               <w:top w:val="nil"/>
               <w:left w:val="nil"/>
               <w:bottom w:val="single" w:sz="12" w:space="0" w:color="1B6B93"/>
               <w:right w:val="nil"/>
             </w:tcBorders>
+            <w:shd w:val="clear" w:color="auto" w:fill="1B6B93"/>
+            <w:tcMar>
+              <w:top w:w="70" w:type="dxa"/>
+              <w:left w:w="130" w:type="dxa"/>
+              <w:bottom w:w="70" w:type="dxa"/>
+              <w:right w:w="130" w:type="dxa"/>
+            </w:tcMar>
+            <w:vAlign w:val="center"/>
           </w:tcPr>
           <w:p>
             <w:pPr>
@@ -444,20 +434,20 @@
       <w:tr>
         <w:tc>
           <w:tcPr>
-            <w:tcW w:type="dxa" w:w="2296"/>
-            <w:tcMar>
-              <w:top w:w="60" w:type="dxa"/>
-              <w:bottom w:w="60" w:type="dxa"/>
-              <w:left w:w="130" w:type="dxa"/>
-              <w:right w:w="130" w:type="dxa"/>
-            </w:tcMar>
-            <w:vAlign w:val="center"/>
+            <w:tcW w:type="dxa" w:w="3028"/>
             <w:tcBorders>
               <w:top w:val="nil"/>
               <w:left w:val="nil"/>
               <w:bottom w:val="single" w:sz="4" w:space="0" w:color="DCE0E6"/>
               <w:right w:val="nil"/>
             </w:tcBorders>
+            <w:tcMar>
+              <w:top w:w="60" w:type="dxa"/>
+              <w:left w:w="130" w:type="dxa"/>
+              <w:bottom w:w="60" w:type="dxa"/>
+              <w:right w:w="130" w:type="dxa"/>
+            </w:tcMar>
+            <w:vAlign w:val="center"/>
           </w:tcPr>
           <w:p>
             <w:pPr>
@@ -472,20 +462,20 @@
         </w:tc>
         <w:tc>
           <w:tcPr>
-            <w:tcW w:type="dxa" w:w="2296"/>
-            <w:tcMar>
-              <w:top w:w="60" w:type="dxa"/>
-              <w:bottom w:w="60" w:type="dxa"/>
-              <w:left w:w="130" w:type="dxa"/>
-              <w:right w:w="130" w:type="dxa"/>
-            </w:tcMar>
-            <w:vAlign w:val="center"/>
+            <w:tcW w:type="dxa" w:w="2840"/>
             <w:tcBorders>
               <w:top w:val="nil"/>
               <w:left w:val="nil"/>
               <w:bottom w:val="single" w:sz="4" w:space="0" w:color="DCE0E6"/>
               <w:right w:val="nil"/>
             </w:tcBorders>
+            <w:tcMar>
+              <w:top w:w="60" w:type="dxa"/>
+              <w:left w:w="130" w:type="dxa"/>
+              <w:bottom w:w="60" w:type="dxa"/>
+              <w:right w:w="130" w:type="dxa"/>
+            </w:tcMar>
+            <w:vAlign w:val="center"/>
           </w:tcPr>
           <w:p>
             <w:pPr>
@@ -500,20 +490,20 @@
         </w:tc>
         <w:tc>
           <w:tcPr>
-            <w:tcW w:type="dxa" w:w="2296"/>
-            <w:tcMar>
-              <w:top w:w="60" w:type="dxa"/>
-              <w:bottom w:w="60" w:type="dxa"/>
-              <w:left w:w="130" w:type="dxa"/>
-              <w:right w:w="130" w:type="dxa"/>
-            </w:tcMar>
-            <w:vAlign w:val="center"/>
+            <w:tcW w:type="dxa" w:w="1602"/>
             <w:tcBorders>
               <w:top w:val="nil"/>
               <w:left w:val="nil"/>
               <w:bottom w:val="single" w:sz="4" w:space="0" w:color="DCE0E6"/>
               <w:right w:val="nil"/>
             </w:tcBorders>
+            <w:tcMar>
+              <w:top w:w="60" w:type="dxa"/>
+              <w:left w:w="130" w:type="dxa"/>
+              <w:bottom w:w="60" w:type="dxa"/>
+              <w:right w:w="130" w:type="dxa"/>
+            </w:tcMar>
+            <w:vAlign w:val="center"/>
           </w:tcPr>
           <w:p>
             <w:pPr>
@@ -528,20 +518,20 @@
         </w:tc>
         <w:tc>
           <w:tcPr>
-            <w:tcW w:type="dxa" w:w="2296"/>
-            <w:tcMar>
-              <w:top w:w="60" w:type="dxa"/>
-              <w:bottom w:w="60" w:type="dxa"/>
-              <w:left w:w="130" w:type="dxa"/>
-              <w:right w:w="130" w:type="dxa"/>
-            </w:tcMar>
-            <w:vAlign w:val="center"/>
+            <w:tcW w:type="dxa" w:w="1714"/>
             <w:tcBorders>
               <w:top w:val="nil"/>
               <w:left w:val="nil"/>
               <w:bottom w:val="single" w:sz="4" w:space="0" w:color="DCE0E6"/>
               <w:right w:val="nil"/>
             </w:tcBorders>
+            <w:tcMar>
+              <w:top w:w="60" w:type="dxa"/>
+              <w:left w:w="130" w:type="dxa"/>
+              <w:bottom w:w="60" w:type="dxa"/>
+              <w:right w:w="130" w:type="dxa"/>
+            </w:tcMar>
+            <w:vAlign w:val="center"/>
           </w:tcPr>
           <w:p>
             <w:pPr>
@@ -562,14 +552,7 @@
       <w:tr>
         <w:tc>
           <w:tcPr>
-            <w:tcW w:type="dxa" w:w="2296"/>
-            <w:tcMar>
-              <w:top w:w="60" w:type="dxa"/>
-              <w:bottom w:w="60" w:type="dxa"/>
-              <w:left w:w="130" w:type="dxa"/>
-              <w:right w:w="130" w:type="dxa"/>
-            </w:tcMar>
-            <w:vAlign w:val="center"/>
+            <w:tcW w:type="dxa" w:w="3028"/>
             <w:tcBorders>
               <w:top w:val="nil"/>
               <w:left w:val="nil"/>
@@ -577,6 +560,13 @@
               <w:right w:val="nil"/>
             </w:tcBorders>
             <w:shd w:val="clear" w:color="auto" w:fill="F5F7FA"/>
+            <w:tcMar>
+              <w:top w:w="60" w:type="dxa"/>
+              <w:left w:w="130" w:type="dxa"/>
+              <w:bottom w:w="60" w:type="dxa"/>
+              <w:right w:w="130" w:type="dxa"/>
+            </w:tcMar>
+            <w:vAlign w:val="center"/>
           </w:tcPr>
           <w:p>
             <w:pPr>
@@ -591,14 +581,7 @@
         </w:tc>
         <w:tc>
           <w:tcPr>
-            <w:tcW w:type="dxa" w:w="2296"/>
-            <w:tcMar>
-              <w:top w:w="60" w:type="dxa"/>
-              <w:bottom w:w="60" w:type="dxa"/>
-              <w:left w:w="130" w:type="dxa"/>
-              <w:right w:w="130" w:type="dxa"/>
-            </w:tcMar>
-            <w:vAlign w:val="center"/>
+            <w:tcW w:type="dxa" w:w="2840"/>
             <w:tcBorders>
               <w:top w:val="nil"/>
               <w:left w:val="nil"/>
@@ -606,6 +589,13 @@
               <w:right w:val="nil"/>
             </w:tcBorders>
             <w:shd w:val="clear" w:color="auto" w:fill="F5F7FA"/>
+            <w:tcMar>
+              <w:top w:w="60" w:type="dxa"/>
+              <w:left w:w="130" w:type="dxa"/>
+              <w:bottom w:w="60" w:type="dxa"/>
+              <w:right w:w="130" w:type="dxa"/>
+            </w:tcMar>
+            <w:vAlign w:val="center"/>
           </w:tcPr>
           <w:p>
             <w:pPr>
@@ -620,14 +610,7 @@
         </w:tc>
         <w:tc>
           <w:tcPr>
-            <w:tcW w:type="dxa" w:w="2296"/>
-            <w:tcMar>
-              <w:top w:w="60" w:type="dxa"/>
-              <w:bottom w:w="60" w:type="dxa"/>
-              <w:left w:w="130" w:type="dxa"/>
-              <w:right w:w="130" w:type="dxa"/>
-            </w:tcMar>
-            <w:vAlign w:val="center"/>
+            <w:tcW w:type="dxa" w:w="1602"/>
             <w:tcBorders>
               <w:top w:val="nil"/>
               <w:left w:val="nil"/>
@@ -635,6 +618,13 @@
               <w:right w:val="nil"/>
             </w:tcBorders>
             <w:shd w:val="clear" w:color="auto" w:fill="F5F7FA"/>
+            <w:tcMar>
+              <w:top w:w="60" w:type="dxa"/>
+              <w:left w:w="130" w:type="dxa"/>
+              <w:bottom w:w="60" w:type="dxa"/>
+              <w:right w:w="130" w:type="dxa"/>
+            </w:tcMar>
+            <w:vAlign w:val="center"/>
           </w:tcPr>
           <w:p>
             <w:pPr>
@@ -649,14 +639,7 @@
         </w:tc>
         <w:tc>
           <w:tcPr>
-            <w:tcW w:type="dxa" w:w="2296"/>
-            <w:tcMar>
-              <w:top w:w="60" w:type="dxa"/>
-              <w:bottom w:w="60" w:type="dxa"/>
-              <w:left w:w="130" w:type="dxa"/>
-              <w:right w:w="130" w:type="dxa"/>
-            </w:tcMar>
-            <w:vAlign w:val="center"/>
+            <w:tcW w:type="dxa" w:w="1714"/>
             <w:tcBorders>
               <w:top w:val="nil"/>
               <w:left w:val="nil"/>
@@ -664,6 +647,13 @@
               <w:right w:val="nil"/>
             </w:tcBorders>
             <w:shd w:val="clear" w:color="auto" w:fill="F5F7FA"/>
+            <w:tcMar>
+              <w:top w:w="60" w:type="dxa"/>
+              <w:left w:w="130" w:type="dxa"/>
+              <w:bottom w:w="60" w:type="dxa"/>
+              <w:right w:w="130" w:type="dxa"/>
+            </w:tcMar>
+            <w:vAlign w:val="center"/>
           </w:tcPr>
           <w:p>
             <w:pPr>
@@ -684,20 +674,20 @@
       <w:tr>
         <w:tc>
           <w:tcPr>
-            <w:tcW w:type="dxa" w:w="2296"/>
-            <w:tcMar>
-              <w:top w:w="60" w:type="dxa"/>
-              <w:bottom w:w="60" w:type="dxa"/>
-              <w:left w:w="130" w:type="dxa"/>
-              <w:right w:w="130" w:type="dxa"/>
-            </w:tcMar>
-            <w:vAlign w:val="center"/>
+            <w:tcW w:type="dxa" w:w="3028"/>
             <w:tcBorders>
               <w:top w:val="nil"/>
               <w:left w:val="nil"/>
               <w:bottom w:val="single" w:sz="4" w:space="0" w:color="DCE0E6"/>
               <w:right w:val="nil"/>
             </w:tcBorders>
+            <w:tcMar>
+              <w:top w:w="60" w:type="dxa"/>
+              <w:left w:w="130" w:type="dxa"/>
+              <w:bottom w:w="60" w:type="dxa"/>
+              <w:right w:w="130" w:type="dxa"/>
+            </w:tcMar>
+            <w:vAlign w:val="center"/>
           </w:tcPr>
           <w:p>
             <w:pPr>
@@ -712,20 +702,20 @@
         </w:tc>
         <w:tc>
           <w:tcPr>
-            <w:tcW w:type="dxa" w:w="2296"/>
-            <w:tcMar>
-              <w:top w:w="60" w:type="dxa"/>
-              <w:bottom w:w="60" w:type="dxa"/>
-              <w:left w:w="130" w:type="dxa"/>
-              <w:right w:w="130" w:type="dxa"/>
-            </w:tcMar>
-            <w:vAlign w:val="center"/>
+            <w:tcW w:type="dxa" w:w="2840"/>
             <w:tcBorders>
               <w:top w:val="nil"/>
               <w:left w:val="nil"/>
               <w:bottom w:val="single" w:sz="4" w:space="0" w:color="DCE0E6"/>
               <w:right w:val="nil"/>
             </w:tcBorders>
+            <w:tcMar>
+              <w:top w:w="60" w:type="dxa"/>
+              <w:left w:w="130" w:type="dxa"/>
+              <w:bottom w:w="60" w:type="dxa"/>
+              <w:right w:w="130" w:type="dxa"/>
+            </w:tcMar>
+            <w:vAlign w:val="center"/>
           </w:tcPr>
           <w:p>
             <w:pPr>
@@ -740,20 +730,20 @@
         </w:tc>
         <w:tc>
           <w:tcPr>
-            <w:tcW w:type="dxa" w:w="2296"/>
-            <w:tcMar>
-              <w:top w:w="60" w:type="dxa"/>
-              <w:bottom w:w="60" w:type="dxa"/>
-              <w:left w:w="130" w:type="dxa"/>
-              <w:right w:w="130" w:type="dxa"/>
-            </w:tcMar>
-            <w:vAlign w:val="center"/>
+            <w:tcW w:type="dxa" w:w="1602"/>
             <w:tcBorders>
               <w:top w:val="nil"/>
               <w:left w:val="nil"/>
               <w:bottom w:val="single" w:sz="4" w:space="0" w:color="DCE0E6"/>
               <w:right w:val="nil"/>
             </w:tcBorders>
+            <w:tcMar>
+              <w:top w:w="60" w:type="dxa"/>
+              <w:left w:w="130" w:type="dxa"/>
+              <w:bottom w:w="60" w:type="dxa"/>
+              <w:right w:w="130" w:type="dxa"/>
+            </w:tcMar>
+            <w:vAlign w:val="center"/>
           </w:tcPr>
           <w:p>
             <w:pPr>
@@ -768,20 +758,20 @@
         </w:tc>
         <w:tc>
           <w:tcPr>
-            <w:tcW w:type="dxa" w:w="2296"/>
-            <w:tcMar>
-              <w:top w:w="60" w:type="dxa"/>
-              <w:bottom w:w="60" w:type="dxa"/>
-              <w:left w:w="130" w:type="dxa"/>
-              <w:right w:w="130" w:type="dxa"/>
-            </w:tcMar>
-            <w:vAlign w:val="center"/>
+            <w:tcW w:type="dxa" w:w="1714"/>
             <w:tcBorders>
               <w:top w:val="nil"/>
               <w:left w:val="nil"/>
               <w:bottom w:val="single" w:sz="4" w:space="0" w:color="DCE0E6"/>
               <w:right w:val="nil"/>
             </w:tcBorders>
+            <w:tcMar>
+              <w:top w:w="60" w:type="dxa"/>
+              <w:left w:w="130" w:type="dxa"/>
+              <w:bottom w:w="60" w:type="dxa"/>
+              <w:right w:w="130" w:type="dxa"/>
+            </w:tcMar>
+            <w:vAlign w:val="center"/>
           </w:tcPr>
           <w:p>
             <w:pPr>
@@ -798,14 +788,7 @@
       <w:tr>
         <w:tc>
           <w:tcPr>
-            <w:tcW w:type="dxa" w:w="2296"/>
-            <w:tcMar>
-              <w:top w:w="60" w:type="dxa"/>
-              <w:bottom w:w="60" w:type="dxa"/>
-              <w:left w:w="130" w:type="dxa"/>
-              <w:right w:w="130" w:type="dxa"/>
-            </w:tcMar>
-            <w:vAlign w:val="center"/>
+            <w:tcW w:type="dxa" w:w="3028"/>
             <w:tcBorders>
               <w:top w:val="nil"/>
               <w:left w:val="nil"/>
@@ -813,6 +796,13 @@
               <w:right w:val="nil"/>
             </w:tcBorders>
             <w:shd w:val="clear" w:color="auto" w:fill="F5F7FA"/>
+            <w:tcMar>
+              <w:top w:w="60" w:type="dxa"/>
+              <w:left w:w="130" w:type="dxa"/>
+              <w:bottom w:w="60" w:type="dxa"/>
+              <w:right w:w="130" w:type="dxa"/>
+            </w:tcMar>
+            <w:vAlign w:val="center"/>
           </w:tcPr>
           <w:p>
             <w:pPr>
@@ -827,14 +817,7 @@
         </w:tc>
         <w:tc>
           <w:tcPr>
-            <w:tcW w:type="dxa" w:w="2296"/>
-            <w:tcMar>
-              <w:top w:w="60" w:type="dxa"/>
-              <w:bottom w:w="60" w:type="dxa"/>
-              <w:left w:w="130" w:type="dxa"/>
-              <w:right w:w="130" w:type="dxa"/>
-            </w:tcMar>
-            <w:vAlign w:val="center"/>
+            <w:tcW w:type="dxa" w:w="2840"/>
             <w:tcBorders>
               <w:top w:val="nil"/>
               <w:left w:val="nil"/>
@@ -842,6 +825,13 @@
               <w:right w:val="nil"/>
             </w:tcBorders>
             <w:shd w:val="clear" w:color="auto" w:fill="F5F7FA"/>
+            <w:tcMar>
+              <w:top w:w="60" w:type="dxa"/>
+              <w:left w:w="130" w:type="dxa"/>
+              <w:bottom w:w="60" w:type="dxa"/>
+              <w:right w:w="130" w:type="dxa"/>
+            </w:tcMar>
+            <w:vAlign w:val="center"/>
           </w:tcPr>
           <w:p>
             <w:pPr>
@@ -856,14 +846,7 @@
         </w:tc>
         <w:tc>
           <w:tcPr>
-            <w:tcW w:type="dxa" w:w="2296"/>
-            <w:tcMar>
-              <w:top w:w="60" w:type="dxa"/>
-              <w:bottom w:w="60" w:type="dxa"/>
-              <w:left w:w="130" w:type="dxa"/>
-              <w:right w:w="130" w:type="dxa"/>
-            </w:tcMar>
-            <w:vAlign w:val="center"/>
+            <w:tcW w:type="dxa" w:w="1602"/>
             <w:tcBorders>
               <w:top w:val="nil"/>
               <w:left w:val="nil"/>
@@ -871,6 +854,13 @@
               <w:right w:val="nil"/>
             </w:tcBorders>
             <w:shd w:val="clear" w:color="auto" w:fill="F5F7FA"/>
+            <w:tcMar>
+              <w:top w:w="60" w:type="dxa"/>
+              <w:left w:w="130" w:type="dxa"/>
+              <w:bottom w:w="60" w:type="dxa"/>
+              <w:right w:w="130" w:type="dxa"/>
+            </w:tcMar>
+            <w:vAlign w:val="center"/>
           </w:tcPr>
           <w:p>
             <w:pPr>
@@ -885,14 +875,7 @@
         </w:tc>
         <w:tc>
           <w:tcPr>
-            <w:tcW w:type="dxa" w:w="2296"/>
-            <w:tcMar>
-              <w:top w:w="60" w:type="dxa"/>
-              <w:bottom w:w="60" w:type="dxa"/>
-              <w:left w:w="130" w:type="dxa"/>
-              <w:right w:w="130" w:type="dxa"/>
-            </w:tcMar>
-            <w:vAlign w:val="center"/>
+            <w:tcW w:type="dxa" w:w="1714"/>
             <w:tcBorders>
               <w:top w:val="nil"/>
               <w:left w:val="nil"/>
@@ -900,6 +883,13 @@
               <w:right w:val="nil"/>
             </w:tcBorders>
             <w:shd w:val="clear" w:color="auto" w:fill="F5F7FA"/>
+            <w:tcMar>
+              <w:top w:w="60" w:type="dxa"/>
+              <w:left w:w="130" w:type="dxa"/>
+              <w:bottom w:w="60" w:type="dxa"/>
+              <w:right w:w="130" w:type="dxa"/>
+            </w:tcMar>
+            <w:vAlign w:val="center"/>
           </w:tcPr>
           <w:p>
             <w:pPr>
@@ -920,20 +910,20 @@
       <w:tr>
         <w:tc>
           <w:tcPr>
-            <w:tcW w:type="dxa" w:w="2296"/>
-            <w:tcMar>
-              <w:top w:w="60" w:type="dxa"/>
-              <w:bottom w:w="60" w:type="dxa"/>
-              <w:left w:w="130" w:type="dxa"/>
-              <w:right w:w="130" w:type="dxa"/>
-            </w:tcMar>
-            <w:vAlign w:val="center"/>
+            <w:tcW w:type="dxa" w:w="3028"/>
             <w:tcBorders>
               <w:top w:val="nil"/>
               <w:left w:val="nil"/>
               <w:bottom w:val="single" w:sz="4" w:space="0" w:color="DCE0E6"/>
               <w:right w:val="nil"/>
             </w:tcBorders>
+            <w:tcMar>
+              <w:top w:w="60" w:type="dxa"/>
+              <w:left w:w="130" w:type="dxa"/>
+              <w:bottom w:w="60" w:type="dxa"/>
+              <w:right w:w="130" w:type="dxa"/>
+            </w:tcMar>
+            <w:vAlign w:val="center"/>
           </w:tcPr>
           <w:p>
             <w:pPr>
@@ -948,20 +938,20 @@
         </w:tc>
         <w:tc>
           <w:tcPr>
-            <w:tcW w:type="dxa" w:w="2296"/>
-            <w:tcMar>
-              <w:top w:w="60" w:type="dxa"/>
-              <w:bottom w:w="60" w:type="dxa"/>
-              <w:left w:w="130" w:type="dxa"/>
-              <w:right w:w="130" w:type="dxa"/>
-            </w:tcMar>
-            <w:vAlign w:val="center"/>
+            <w:tcW w:type="dxa" w:w="2840"/>
             <w:tcBorders>
               <w:top w:val="nil"/>
               <w:left w:val="nil"/>
               <w:bottom w:val="single" w:sz="4" w:space="0" w:color="DCE0E6"/>
               <w:right w:val="nil"/>
             </w:tcBorders>
+            <w:tcMar>
+              <w:top w:w="60" w:type="dxa"/>
+              <w:left w:w="130" w:type="dxa"/>
+              <w:bottom w:w="60" w:type="dxa"/>
+              <w:right w:w="130" w:type="dxa"/>
+            </w:tcMar>
+            <w:vAlign w:val="center"/>
           </w:tcPr>
           <w:p>
             <w:pPr>
@@ -976,20 +966,20 @@
         </w:tc>
         <w:tc>
           <w:tcPr>
-            <w:tcW w:type="dxa" w:w="2296"/>
-            <w:tcMar>
-              <w:top w:w="60" w:type="dxa"/>
-              <w:bottom w:w="60" w:type="dxa"/>
-              <w:left w:w="130" w:type="dxa"/>
-              <w:right w:w="130" w:type="dxa"/>
-            </w:tcMar>
-            <w:vAlign w:val="center"/>
+            <w:tcW w:type="dxa" w:w="1602"/>
             <w:tcBorders>
               <w:top w:val="nil"/>
               <w:left w:val="nil"/>
               <w:bottom w:val="single" w:sz="4" w:space="0" w:color="DCE0E6"/>
               <w:right w:val="nil"/>
             </w:tcBorders>
+            <w:tcMar>
+              <w:top w:w="60" w:type="dxa"/>
+              <w:left w:w="130" w:type="dxa"/>
+              <w:bottom w:w="60" w:type="dxa"/>
+              <w:right w:w="130" w:type="dxa"/>
+            </w:tcMar>
+            <w:vAlign w:val="center"/>
           </w:tcPr>
           <w:p>
             <w:pPr>
@@ -1004,20 +994,20 @@
         </w:tc>
         <w:tc>
           <w:tcPr>
-            <w:tcW w:type="dxa" w:w="2296"/>
-            <w:tcMar>
-              <w:top w:w="60" w:type="dxa"/>
-              <w:bottom w:w="60" w:type="dxa"/>
-              <w:left w:w="130" w:type="dxa"/>
-              <w:right w:w="130" w:type="dxa"/>
-            </w:tcMar>
-            <w:vAlign w:val="center"/>
+            <w:tcW w:type="dxa" w:w="1714"/>
             <w:tcBorders>
               <w:top w:val="nil"/>
               <w:left w:val="nil"/>
               <w:bottom w:val="single" w:sz="4" w:space="0" w:color="DCE0E6"/>
               <w:right w:val="nil"/>
             </w:tcBorders>
+            <w:tcMar>
+              <w:top w:w="60" w:type="dxa"/>
+              <w:left w:w="130" w:type="dxa"/>
+              <w:bottom w:w="60" w:type="dxa"/>
+              <w:right w:w="130" w:type="dxa"/>
+            </w:tcMar>
+            <w:vAlign w:val="center"/>
           </w:tcPr>
           <w:p>
             <w:pPr>
@@ -1072,9 +1062,7 @@
         <w:t>€850,000</w:t>
       </w:r>
       <w:r>
-        <w:t>, split across three phases as</w:t>
-        <w:br/>
-        <w:t xml:space="preserve">detailed below. A </w:t>
+        <w:t xml:space="preserve">, split across three phases as detailed below. A </w:t>
       </w:r>
       <w:r>
         <w:rPr>
@@ -1192,17 +1180,17 @@
         <w:tc>
           <w:tcPr>
             <w:tcW w:type="dxa" w:w="9184"/>
-            <w:shd w:val="clear" w:color="auto" w:fill="FFF4E5"/>
             <w:tcBorders>
               <w:top w:val="single" w:sz="4" w:space="0" w:color="FFF4E5"/>
               <w:left w:val="single" w:sz="24" w:space="0" w:color="ED7D31"/>
               <w:bottom w:val="single" w:sz="4" w:space="0" w:color="FFF4E5"/>
               <w:right w:val="single" w:sz="4" w:space="0" w:color="FFF4E5"/>
             </w:tcBorders>
+            <w:shd w:val="clear" w:color="auto" w:fill="FFF4E5"/>
             <w:tcMar>
               <w:top w:w="140" w:type="dxa"/>
+              <w:left w:w="200" w:type="dxa"/>
               <w:bottom w:w="140" w:type="dxa"/>
-              <w:left w:w="200" w:type="dxa"/>
               <w:right w:w="200" w:type="dxa"/>
             </w:tcMar>
           </w:tcPr>
@@ -1237,9 +1225,7 @@
               <w:t>72-hour</w:t>
             </w:r>
             <w:r>
-              <w:t xml:space="preserve"> downtime window. A</w:t>
-              <w:br/>
-              <w:t>rollback plan is in place with RPO &lt; 4h and RTO &lt; 2h.</w:t>
+              <w:t xml:space="preserve"> downtime window. A rollback plan is in place with RPO &lt; 4h and RTO &lt; 2h.</w:t>
             </w:r>
           </w:p>
         </w:tc>
@@ -1266,9 +1252,7 @@
         <w:jc w:val="left"/>
       </w:pPr>
       <w:r>
-        <w:t>Introduce AI systems for repetitive-task automation and decision support. The</w:t>
-        <w:br/>
-        <w:t>platform is organized in three layers, each with clear ownership.</w:t>
+        <w:t>Introduce AI systems for repetitive-task automation and decision support. The platform is organized in three layers, each with clear ownership.</w:t>
       </w:r>
     </w:p>
     <w:tbl>
@@ -1278,8 +1262,8 @@
         <w:tblLook w:firstColumn="1" w:firstRow="1" w:lastColumn="0" w:lastRow="0" w:noHBand="0" w:noVBand="1" w:val="04A0"/>
       </w:tblPr>
       <w:tblGrid>
-        <w:gridCol w:w="4592"/>
-        <w:gridCol w:w="4592"/>
+        <w:gridCol w:w="3038"/>
+        <w:gridCol w:w="6146"/>
       </w:tblGrid>
       <w:tr>
         <w:trPr>
@@ -1287,21 +1271,21 @@
         </w:trPr>
         <w:tc>
           <w:tcPr>
-            <w:tcW w:type="dxa" w:w="4592"/>
-            <w:tcMar>
-              <w:top w:w="70" w:type="dxa"/>
-              <w:bottom w:w="70" w:type="dxa"/>
-              <w:left w:w="130" w:type="dxa"/>
-              <w:right w:w="130" w:type="dxa"/>
-            </w:tcMar>
-            <w:vAlign w:val="center"/>
-            <w:shd w:val="clear" w:color="auto" w:fill="1B6B93"/>
+            <w:tcW w:type="dxa" w:w="3038"/>
             <w:tcBorders>
               <w:top w:val="nil"/>
               <w:left w:val="nil"/>
               <w:bottom w:val="single" w:sz="12" w:space="0" w:color="1B6B93"/>
               <w:right w:val="nil"/>
             </w:tcBorders>
+            <w:shd w:val="clear" w:color="auto" w:fill="1B6B93"/>
+            <w:tcMar>
+              <w:top w:w="70" w:type="dxa"/>
+              <w:left w:w="130" w:type="dxa"/>
+              <w:bottom w:w="70" w:type="dxa"/>
+              <w:right w:w="130" w:type="dxa"/>
+            </w:tcMar>
+            <w:vAlign w:val="center"/>
           </w:tcPr>
           <w:p>
             <w:pPr>
@@ -1321,21 +1305,21 @@
         </w:tc>
         <w:tc>
           <w:tcPr>
-            <w:tcW w:type="dxa" w:w="4592"/>
-            <w:tcMar>
-              <w:top w:w="70" w:type="dxa"/>
-              <w:bottom w:w="70" w:type="dxa"/>
-              <w:left w:w="130" w:type="dxa"/>
-              <w:right w:w="130" w:type="dxa"/>
-            </w:tcMar>
-            <w:vAlign w:val="center"/>
-            <w:shd w:val="clear" w:color="auto" w:fill="1B6B93"/>
+            <w:tcW w:type="dxa" w:w="6146"/>
             <w:tcBorders>
               <w:top w:val="nil"/>
               <w:left w:val="nil"/>
               <w:bottom w:val="single" w:sz="12" w:space="0" w:color="1B6B93"/>
               <w:right w:val="nil"/>
             </w:tcBorders>
+            <w:shd w:val="clear" w:color="auto" w:fill="1B6B93"/>
+            <w:tcMar>
+              <w:top w:w="70" w:type="dxa"/>
+              <w:left w:w="130" w:type="dxa"/>
+              <w:bottom w:w="70" w:type="dxa"/>
+              <w:right w:w="130" w:type="dxa"/>
+            </w:tcMar>
+            <w:vAlign w:val="center"/>
           </w:tcPr>
           <w:p>
             <w:pPr>
@@ -1357,20 +1341,20 @@
       <w:tr>
         <w:tc>
           <w:tcPr>
-            <w:tcW w:type="dxa" w:w="4592"/>
-            <w:tcMar>
-              <w:top w:w="60" w:type="dxa"/>
-              <w:bottom w:w="60" w:type="dxa"/>
-              <w:left w:w="130" w:type="dxa"/>
-              <w:right w:w="130" w:type="dxa"/>
-            </w:tcMar>
-            <w:vAlign w:val="center"/>
+            <w:tcW w:type="dxa" w:w="3038"/>
             <w:tcBorders>
               <w:top w:val="nil"/>
               <w:left w:val="nil"/>
               <w:bottom w:val="single" w:sz="4" w:space="0" w:color="DCE0E6"/>
               <w:right w:val="nil"/>
             </w:tcBorders>
+            <w:tcMar>
+              <w:top w:w="60" w:type="dxa"/>
+              <w:left w:w="130" w:type="dxa"/>
+              <w:bottom w:w="60" w:type="dxa"/>
+              <w:right w:w="130" w:type="dxa"/>
+            </w:tcMar>
+            <w:vAlign w:val="center"/>
           </w:tcPr>
           <w:p>
             <w:pPr>
@@ -1388,20 +1372,20 @@
         </w:tc>
         <w:tc>
           <w:tcPr>
-            <w:tcW w:type="dxa" w:w="4592"/>
-            <w:tcMar>
-              <w:top w:w="60" w:type="dxa"/>
-              <w:bottom w:w="60" w:type="dxa"/>
-              <w:left w:w="130" w:type="dxa"/>
-              <w:right w:w="130" w:type="dxa"/>
-            </w:tcMar>
-            <w:vAlign w:val="center"/>
+            <w:tcW w:type="dxa" w:w="6146"/>
             <w:tcBorders>
               <w:top w:val="nil"/>
               <w:left w:val="nil"/>
               <w:bottom w:val="single" w:sz="4" w:space="0" w:color="DCE0E6"/>
               <w:right w:val="nil"/>
             </w:tcBorders>
+            <w:tcMar>
+              <w:top w:w="60" w:type="dxa"/>
+              <w:left w:w="130" w:type="dxa"/>
+              <w:bottom w:w="60" w:type="dxa"/>
+              <w:right w:w="130" w:type="dxa"/>
+            </w:tcMar>
+            <w:vAlign w:val="center"/>
           </w:tcPr>
           <w:p>
             <w:pPr>
@@ -1418,14 +1402,7 @@
       <w:tr>
         <w:tc>
           <w:tcPr>
-            <w:tcW w:type="dxa" w:w="4592"/>
-            <w:tcMar>
-              <w:top w:w="60" w:type="dxa"/>
-              <w:bottom w:w="60" w:type="dxa"/>
-              <w:left w:w="130" w:type="dxa"/>
-              <w:right w:w="130" w:type="dxa"/>
-            </w:tcMar>
-            <w:vAlign w:val="center"/>
+            <w:tcW w:type="dxa" w:w="3038"/>
             <w:tcBorders>
               <w:top w:val="nil"/>
               <w:left w:val="nil"/>
@@ -1433,6 +1410,13 @@
               <w:right w:val="nil"/>
             </w:tcBorders>
             <w:shd w:val="clear" w:color="auto" w:fill="F5F7FA"/>
+            <w:tcMar>
+              <w:top w:w="60" w:type="dxa"/>
+              <w:left w:w="130" w:type="dxa"/>
+              <w:bottom w:w="60" w:type="dxa"/>
+              <w:right w:w="130" w:type="dxa"/>
+            </w:tcMar>
+            <w:vAlign w:val="center"/>
           </w:tcPr>
           <w:p>
             <w:pPr>
@@ -1450,14 +1434,7 @@
         </w:tc>
         <w:tc>
           <w:tcPr>
-            <w:tcW w:type="dxa" w:w="4592"/>
-            <w:tcMar>
-              <w:top w:w="60" w:type="dxa"/>
-              <w:bottom w:w="60" w:type="dxa"/>
-              <w:left w:w="130" w:type="dxa"/>
-              <w:right w:w="130" w:type="dxa"/>
-            </w:tcMar>
-            <w:vAlign w:val="center"/>
+            <w:tcW w:type="dxa" w:w="6146"/>
             <w:tcBorders>
               <w:top w:val="nil"/>
               <w:left w:val="nil"/>
@@ -1465,6 +1442,13 @@
               <w:right w:val="nil"/>
             </w:tcBorders>
             <w:shd w:val="clear" w:color="auto" w:fill="F5F7FA"/>
+            <w:tcMar>
+              <w:top w:w="60" w:type="dxa"/>
+              <w:left w:w="130" w:type="dxa"/>
+              <w:bottom w:w="60" w:type="dxa"/>
+              <w:right w:w="130" w:type="dxa"/>
+            </w:tcMar>
+            <w:vAlign w:val="center"/>
           </w:tcPr>
           <w:p>
             <w:pPr>
@@ -1481,20 +1465,20 @@
       <w:tr>
         <w:tc>
           <w:tcPr>
-            <w:tcW w:type="dxa" w:w="4592"/>
-            <w:tcMar>
-              <w:top w:w="60" w:type="dxa"/>
-              <w:bottom w:w="60" w:type="dxa"/>
-              <w:left w:w="130" w:type="dxa"/>
-              <w:right w:w="130" w:type="dxa"/>
-            </w:tcMar>
-            <w:vAlign w:val="center"/>
+            <w:tcW w:type="dxa" w:w="3038"/>
             <w:tcBorders>
               <w:top w:val="nil"/>
               <w:left w:val="nil"/>
               <w:bottom w:val="single" w:sz="4" w:space="0" w:color="DCE0E6"/>
               <w:right w:val="nil"/>
             </w:tcBorders>
+            <w:tcMar>
+              <w:top w:w="60" w:type="dxa"/>
+              <w:left w:w="130" w:type="dxa"/>
+              <w:bottom w:w="60" w:type="dxa"/>
+              <w:right w:w="130" w:type="dxa"/>
+            </w:tcMar>
+            <w:vAlign w:val="center"/>
           </w:tcPr>
           <w:p>
             <w:pPr>
@@ -1512,20 +1496,20 @@
         </w:tc>
         <w:tc>
           <w:tcPr>
-            <w:tcW w:type="dxa" w:w="4592"/>
-            <w:tcMar>
-              <w:top w:w="60" w:type="dxa"/>
-              <w:bottom w:w="60" w:type="dxa"/>
-              <w:left w:w="130" w:type="dxa"/>
-              <w:right w:w="130" w:type="dxa"/>
-            </w:tcMar>
-            <w:vAlign w:val="center"/>
+            <w:tcW w:type="dxa" w:w="6146"/>
             <w:tcBorders>
               <w:top w:val="nil"/>
               <w:left w:val="nil"/>
               <w:bottom w:val="single" w:sz="4" w:space="0" w:color="DCE0E6"/>
               <w:right w:val="nil"/>
             </w:tcBorders>
+            <w:tcMar>
+              <w:top w:w="60" w:type="dxa"/>
+              <w:left w:w="130" w:type="dxa"/>
+              <w:bottom w:w="60" w:type="dxa"/>
+              <w:right w:w="130" w:type="dxa"/>
+            </w:tcMar>
+            <w:vAlign w:val="center"/>
           </w:tcPr>
           <w:p>
             <w:pPr>
@@ -1667,11 +1651,11 @@
         <w:tblLook w:firstColumn="1" w:firstRow="1" w:lastColumn="0" w:lastRow="0" w:noHBand="0" w:noVBand="1" w:val="04A0"/>
       </w:tblPr>
       <w:tblGrid>
-        <w:gridCol w:w="1837"/>
-        <w:gridCol w:w="1837"/>
-        <w:gridCol w:w="1837"/>
-        <w:gridCol w:w="1837"/>
-        <w:gridCol w:w="1837"/>
+        <w:gridCol w:w="1015"/>
+        <w:gridCol w:w="2114"/>
+        <w:gridCol w:w="1375"/>
+        <w:gridCol w:w="1311"/>
+        <w:gridCol w:w="3369"/>
       </w:tblGrid>
       <w:tr>
         <w:trPr>
@@ -1679,21 +1663,21 @@
         </w:trPr>
         <w:tc>
           <w:tcPr>
-            <w:tcW w:type="dxa" w:w="1836"/>
-            <w:tcMar>
-              <w:top w:w="70" w:type="dxa"/>
-              <w:bottom w:w="70" w:type="dxa"/>
-              <w:left w:w="130" w:type="dxa"/>
-              <w:right w:w="130" w:type="dxa"/>
-            </w:tcMar>
-            <w:vAlign w:val="center"/>
-            <w:shd w:val="clear" w:color="auto" w:fill="1B6B93"/>
+            <w:tcW w:type="dxa" w:w="1015"/>
             <w:tcBorders>
               <w:top w:val="nil"/>
               <w:left w:val="nil"/>
               <w:bottom w:val="single" w:sz="12" w:space="0" w:color="1B6B93"/>
               <w:right w:val="nil"/>
             </w:tcBorders>
+            <w:shd w:val="clear" w:color="auto" w:fill="1B6B93"/>
+            <w:tcMar>
+              <w:top w:w="70" w:type="dxa"/>
+              <w:left w:w="130" w:type="dxa"/>
+              <w:bottom w:w="70" w:type="dxa"/>
+              <w:right w:w="130" w:type="dxa"/>
+            </w:tcMar>
+            <w:vAlign w:val="center"/>
           </w:tcPr>
           <w:p>
             <w:pPr>
@@ -1713,21 +1697,21 @@
         </w:tc>
         <w:tc>
           <w:tcPr>
-            <w:tcW w:type="dxa" w:w="1836"/>
-            <w:tcMar>
-              <w:top w:w="70" w:type="dxa"/>
-              <w:bottom w:w="70" w:type="dxa"/>
-              <w:left w:w="130" w:type="dxa"/>
-              <w:right w:w="130" w:type="dxa"/>
-            </w:tcMar>
-            <w:vAlign w:val="center"/>
-            <w:shd w:val="clear" w:color="auto" w:fill="1B6B93"/>
+            <w:tcW w:type="dxa" w:w="2114"/>
             <w:tcBorders>
               <w:top w:val="nil"/>
               <w:left w:val="nil"/>
               <w:bottom w:val="single" w:sz="12" w:space="0" w:color="1B6B93"/>
               <w:right w:val="nil"/>
             </w:tcBorders>
+            <w:shd w:val="clear" w:color="auto" w:fill="1B6B93"/>
+            <w:tcMar>
+              <w:top w:w="70" w:type="dxa"/>
+              <w:left w:w="130" w:type="dxa"/>
+              <w:bottom w:w="70" w:type="dxa"/>
+              <w:right w:w="130" w:type="dxa"/>
+            </w:tcMar>
+            <w:vAlign w:val="center"/>
           </w:tcPr>
           <w:p>
             <w:pPr>
@@ -1747,21 +1731,21 @@
         </w:tc>
         <w:tc>
           <w:tcPr>
-            <w:tcW w:type="dxa" w:w="1836"/>
-            <w:tcMar>
-              <w:top w:w="70" w:type="dxa"/>
-              <w:bottom w:w="70" w:type="dxa"/>
-              <w:left w:w="130" w:type="dxa"/>
-              <w:right w:w="130" w:type="dxa"/>
-            </w:tcMar>
-            <w:vAlign w:val="center"/>
-            <w:shd w:val="clear" w:color="auto" w:fill="1B6B93"/>
+            <w:tcW w:type="dxa" w:w="1375"/>
             <w:tcBorders>
               <w:top w:val="nil"/>
               <w:left w:val="nil"/>
               <w:bottom w:val="single" w:sz="12" w:space="0" w:color="1B6B93"/>
               <w:right w:val="nil"/>
             </w:tcBorders>
+            <w:shd w:val="clear" w:color="auto" w:fill="1B6B93"/>
+            <w:tcMar>
+              <w:top w:w="70" w:type="dxa"/>
+              <w:left w:w="130" w:type="dxa"/>
+              <w:bottom w:w="70" w:type="dxa"/>
+              <w:right w:w="130" w:type="dxa"/>
+            </w:tcMar>
+            <w:vAlign w:val="center"/>
           </w:tcPr>
           <w:p>
             <w:pPr>
@@ -1781,21 +1765,21 @@
         </w:tc>
         <w:tc>
           <w:tcPr>
-            <w:tcW w:type="dxa" w:w="1836"/>
-            <w:tcMar>
-              <w:top w:w="70" w:type="dxa"/>
-              <w:bottom w:w="70" w:type="dxa"/>
-              <w:left w:w="130" w:type="dxa"/>
-              <w:right w:w="130" w:type="dxa"/>
-            </w:tcMar>
-            <w:vAlign w:val="center"/>
-            <w:shd w:val="clear" w:color="auto" w:fill="1B6B93"/>
+            <w:tcW w:type="dxa" w:w="1311"/>
             <w:tcBorders>
               <w:top w:val="nil"/>
               <w:left w:val="nil"/>
               <w:bottom w:val="single" w:sz="12" w:space="0" w:color="1B6B93"/>
               <w:right w:val="nil"/>
             </w:tcBorders>
+            <w:shd w:val="clear" w:color="auto" w:fill="1B6B93"/>
+            <w:tcMar>
+              <w:top w:w="70" w:type="dxa"/>
+              <w:left w:w="130" w:type="dxa"/>
+              <w:bottom w:w="70" w:type="dxa"/>
+              <w:right w:w="130" w:type="dxa"/>
+            </w:tcMar>
+            <w:vAlign w:val="center"/>
           </w:tcPr>
           <w:p>
             <w:pPr>
@@ -1815,21 +1799,21 @@
         </w:tc>
         <w:tc>
           <w:tcPr>
-            <w:tcW w:type="dxa" w:w="1840"/>
-            <w:tcMar>
-              <w:top w:w="70" w:type="dxa"/>
-              <w:bottom w:w="70" w:type="dxa"/>
-              <w:left w:w="130" w:type="dxa"/>
-              <w:right w:w="130" w:type="dxa"/>
-            </w:tcMar>
-            <w:vAlign w:val="center"/>
-            <w:shd w:val="clear" w:color="auto" w:fill="1B6B93"/>
+            <w:tcW w:type="dxa" w:w="3369"/>
             <w:tcBorders>
               <w:top w:val="nil"/>
               <w:left w:val="nil"/>
               <w:bottom w:val="single" w:sz="12" w:space="0" w:color="1B6B93"/>
               <w:right w:val="nil"/>
             </w:tcBorders>
+            <w:shd w:val="clear" w:color="auto" w:fill="1B6B93"/>
+            <w:tcMar>
+              <w:top w:w="70" w:type="dxa"/>
+              <w:left w:w="130" w:type="dxa"/>
+              <w:bottom w:w="70" w:type="dxa"/>
+              <w:right w:w="130" w:type="dxa"/>
+            </w:tcMar>
+            <w:vAlign w:val="center"/>
           </w:tcPr>
           <w:p>
             <w:pPr>
@@ -1851,20 +1835,20 @@
       <w:tr>
         <w:tc>
           <w:tcPr>
-            <w:tcW w:type="dxa" w:w="1836"/>
-            <w:tcMar>
-              <w:top w:w="60" w:type="dxa"/>
-              <w:bottom w:w="60" w:type="dxa"/>
-              <w:left w:w="130" w:type="dxa"/>
-              <w:right w:w="130" w:type="dxa"/>
-            </w:tcMar>
-            <w:vAlign w:val="center"/>
+            <w:tcW w:type="dxa" w:w="1015"/>
             <w:tcBorders>
               <w:top w:val="nil"/>
               <w:left w:val="nil"/>
               <w:bottom w:val="single" w:sz="4" w:space="0" w:color="DCE0E6"/>
               <w:right w:val="nil"/>
             </w:tcBorders>
+            <w:tcMar>
+              <w:top w:w="60" w:type="dxa"/>
+              <w:left w:w="130" w:type="dxa"/>
+              <w:bottom w:w="60" w:type="dxa"/>
+              <w:right w:w="130" w:type="dxa"/>
+            </w:tcMar>
+            <w:vAlign w:val="center"/>
           </w:tcPr>
           <w:p>
             <w:pPr>
@@ -1879,20 +1863,20 @@
         </w:tc>
         <w:tc>
           <w:tcPr>
-            <w:tcW w:type="dxa" w:w="1836"/>
-            <w:tcMar>
-              <w:top w:w="60" w:type="dxa"/>
-              <w:bottom w:w="60" w:type="dxa"/>
-              <w:left w:w="130" w:type="dxa"/>
-              <w:right w:w="130" w:type="dxa"/>
-            </w:tcMar>
-            <w:vAlign w:val="center"/>
+            <w:tcW w:type="dxa" w:w="2114"/>
             <w:tcBorders>
               <w:top w:val="nil"/>
               <w:left w:val="nil"/>
               <w:bottom w:val="single" w:sz="4" w:space="0" w:color="DCE0E6"/>
               <w:right w:val="nil"/>
             </w:tcBorders>
+            <w:tcMar>
+              <w:top w:w="60" w:type="dxa"/>
+              <w:left w:w="130" w:type="dxa"/>
+              <w:bottom w:w="60" w:type="dxa"/>
+              <w:right w:w="130" w:type="dxa"/>
+            </w:tcMar>
+            <w:vAlign w:val="center"/>
           </w:tcPr>
           <w:p>
             <w:pPr>
@@ -1907,20 +1891,20 @@
         </w:tc>
         <w:tc>
           <w:tcPr>
-            <w:tcW w:type="dxa" w:w="1836"/>
-            <w:tcMar>
-              <w:top w:w="60" w:type="dxa"/>
-              <w:bottom w:w="60" w:type="dxa"/>
-              <w:left w:w="130" w:type="dxa"/>
-              <w:right w:w="130" w:type="dxa"/>
-            </w:tcMar>
-            <w:vAlign w:val="center"/>
+            <w:tcW w:type="dxa" w:w="1375"/>
             <w:tcBorders>
               <w:top w:val="nil"/>
               <w:left w:val="nil"/>
               <w:bottom w:val="single" w:sz="4" w:space="0" w:color="DCE0E6"/>
               <w:right w:val="nil"/>
             </w:tcBorders>
+            <w:tcMar>
+              <w:top w:w="60" w:type="dxa"/>
+              <w:left w:w="130" w:type="dxa"/>
+              <w:bottom w:w="60" w:type="dxa"/>
+              <w:right w:w="130" w:type="dxa"/>
+            </w:tcMar>
+            <w:vAlign w:val="center"/>
           </w:tcPr>
           <w:p>
             <w:pPr>
@@ -1935,20 +1919,20 @@
         </w:tc>
         <w:tc>
           <w:tcPr>
-            <w:tcW w:type="dxa" w:w="1836"/>
-            <w:tcMar>
-              <w:top w:w="60" w:type="dxa"/>
-              <w:bottom w:w="60" w:type="dxa"/>
-              <w:left w:w="130" w:type="dxa"/>
-              <w:right w:w="130" w:type="dxa"/>
-            </w:tcMar>
-            <w:vAlign w:val="center"/>
+            <w:tcW w:type="dxa" w:w="1311"/>
             <w:tcBorders>
               <w:top w:val="nil"/>
               <w:left w:val="nil"/>
               <w:bottom w:val="single" w:sz="4" w:space="0" w:color="DCE0E6"/>
               <w:right w:val="nil"/>
             </w:tcBorders>
+            <w:tcMar>
+              <w:top w:w="60" w:type="dxa"/>
+              <w:left w:w="130" w:type="dxa"/>
+              <w:bottom w:w="60" w:type="dxa"/>
+              <w:right w:w="130" w:type="dxa"/>
+            </w:tcMar>
+            <w:vAlign w:val="center"/>
           </w:tcPr>
           <w:p>
             <w:pPr>
@@ -1963,20 +1947,20 @@
         </w:tc>
         <w:tc>
           <w:tcPr>
-            <w:tcW w:type="dxa" w:w="1840"/>
-            <w:tcMar>
-              <w:top w:w="60" w:type="dxa"/>
-              <w:bottom w:w="60" w:type="dxa"/>
-              <w:left w:w="130" w:type="dxa"/>
-              <w:right w:w="130" w:type="dxa"/>
-            </w:tcMar>
-            <w:vAlign w:val="center"/>
+            <w:tcW w:type="dxa" w:w="3369"/>
             <w:tcBorders>
               <w:top w:val="nil"/>
               <w:left w:val="nil"/>
               <w:bottom w:val="single" w:sz="4" w:space="0" w:color="DCE0E6"/>
               <w:right w:val="nil"/>
             </w:tcBorders>
+            <w:tcMar>
+              <w:top w:w="60" w:type="dxa"/>
+              <w:left w:w="130" w:type="dxa"/>
+              <w:bottom w:w="60" w:type="dxa"/>
+              <w:right w:w="130" w:type="dxa"/>
+            </w:tcMar>
+            <w:vAlign w:val="center"/>
           </w:tcPr>
           <w:p>
             <w:pPr>
@@ -1993,14 +1977,7 @@
       <w:tr>
         <w:tc>
           <w:tcPr>
-            <w:tcW w:type="dxa" w:w="1836"/>
-            <w:tcMar>
-              <w:top w:w="60" w:type="dxa"/>
-              <w:bottom w:w="60" w:type="dxa"/>
-              <w:left w:w="130" w:type="dxa"/>
-              <w:right w:w="130" w:type="dxa"/>
-            </w:tcMar>
-            <w:vAlign w:val="center"/>
+            <w:tcW w:type="dxa" w:w="1015"/>
             <w:tcBorders>
               <w:top w:val="nil"/>
               <w:left w:val="nil"/>
@@ -2008,6 +1985,13 @@
               <w:right w:val="nil"/>
             </w:tcBorders>
             <w:shd w:val="clear" w:color="auto" w:fill="F5F7FA"/>
+            <w:tcMar>
+              <w:top w:w="60" w:type="dxa"/>
+              <w:left w:w="130" w:type="dxa"/>
+              <w:bottom w:w="60" w:type="dxa"/>
+              <w:right w:w="130" w:type="dxa"/>
+            </w:tcMar>
+            <w:vAlign w:val="center"/>
           </w:tcPr>
           <w:p>
             <w:pPr>
@@ -2022,14 +2006,7 @@
         </w:tc>
         <w:tc>
           <w:tcPr>
-            <w:tcW w:type="dxa" w:w="1836"/>
-            <w:tcMar>
-              <w:top w:w="60" w:type="dxa"/>
-              <w:bottom w:w="60" w:type="dxa"/>
-              <w:left w:w="130" w:type="dxa"/>
-              <w:right w:w="130" w:type="dxa"/>
-            </w:tcMar>
-            <w:vAlign w:val="center"/>
+            <w:tcW w:type="dxa" w:w="2114"/>
             <w:tcBorders>
               <w:top w:val="nil"/>
               <w:left w:val="nil"/>
@@ -2037,6 +2014,13 @@
               <w:right w:val="nil"/>
             </w:tcBorders>
             <w:shd w:val="clear" w:color="auto" w:fill="F5F7FA"/>
+            <w:tcMar>
+              <w:top w:w="60" w:type="dxa"/>
+              <w:left w:w="130" w:type="dxa"/>
+              <w:bottom w:w="60" w:type="dxa"/>
+              <w:right w:w="130" w:type="dxa"/>
+            </w:tcMar>
+            <w:vAlign w:val="center"/>
           </w:tcPr>
           <w:p>
             <w:pPr>
@@ -2051,14 +2035,7 @@
         </w:tc>
         <w:tc>
           <w:tcPr>
-            <w:tcW w:type="dxa" w:w="1836"/>
-            <w:tcMar>
-              <w:top w:w="60" w:type="dxa"/>
-              <w:bottom w:w="60" w:type="dxa"/>
-              <w:left w:w="130" w:type="dxa"/>
-              <w:right w:w="130" w:type="dxa"/>
-            </w:tcMar>
-            <w:vAlign w:val="center"/>
+            <w:tcW w:type="dxa" w:w="1375"/>
             <w:tcBorders>
               <w:top w:val="nil"/>
               <w:left w:val="nil"/>
@@ -2066,6 +2043,13 @@
               <w:right w:val="nil"/>
             </w:tcBorders>
             <w:shd w:val="clear" w:color="auto" w:fill="F5F7FA"/>
+            <w:tcMar>
+              <w:top w:w="60" w:type="dxa"/>
+              <w:left w:w="130" w:type="dxa"/>
+              <w:bottom w:w="60" w:type="dxa"/>
+              <w:right w:w="130" w:type="dxa"/>
+            </w:tcMar>
+            <w:vAlign w:val="center"/>
           </w:tcPr>
           <w:p>
             <w:pPr>
@@ -2080,14 +2064,7 @@
         </w:tc>
         <w:tc>
           <w:tcPr>
-            <w:tcW w:type="dxa" w:w="1836"/>
-            <w:tcMar>
-              <w:top w:w="60" w:type="dxa"/>
-              <w:bottom w:w="60" w:type="dxa"/>
-              <w:left w:w="130" w:type="dxa"/>
-              <w:right w:w="130" w:type="dxa"/>
-            </w:tcMar>
-            <w:vAlign w:val="center"/>
+            <w:tcW w:type="dxa" w:w="1311"/>
             <w:tcBorders>
               <w:top w:val="nil"/>
               <w:left w:val="nil"/>
@@ -2095,6 +2072,13 @@
               <w:right w:val="nil"/>
             </w:tcBorders>
             <w:shd w:val="clear" w:color="auto" w:fill="F5F7FA"/>
+            <w:tcMar>
+              <w:top w:w="60" w:type="dxa"/>
+              <w:left w:w="130" w:type="dxa"/>
+              <w:bottom w:w="60" w:type="dxa"/>
+              <w:right w:w="130" w:type="dxa"/>
+            </w:tcMar>
+            <w:vAlign w:val="center"/>
           </w:tcPr>
           <w:p>
             <w:pPr>
@@ -2109,14 +2093,7 @@
         </w:tc>
         <w:tc>
           <w:tcPr>
-            <w:tcW w:type="dxa" w:w="1840"/>
-            <w:tcMar>
-              <w:top w:w="60" w:type="dxa"/>
-              <w:bottom w:w="60" w:type="dxa"/>
-              <w:left w:w="130" w:type="dxa"/>
-              <w:right w:w="130" w:type="dxa"/>
-            </w:tcMar>
-            <w:vAlign w:val="center"/>
+            <w:tcW w:type="dxa" w:w="3369"/>
             <w:tcBorders>
               <w:top w:val="nil"/>
               <w:left w:val="nil"/>
@@ -2124,6 +2101,13 @@
               <w:right w:val="nil"/>
             </w:tcBorders>
             <w:shd w:val="clear" w:color="auto" w:fill="F5F7FA"/>
+            <w:tcMar>
+              <w:top w:w="60" w:type="dxa"/>
+              <w:left w:w="130" w:type="dxa"/>
+              <w:bottom w:w="60" w:type="dxa"/>
+              <w:right w:w="130" w:type="dxa"/>
+            </w:tcMar>
+            <w:vAlign w:val="center"/>
           </w:tcPr>
           <w:p>
             <w:pPr>
@@ -2140,20 +2124,20 @@
       <w:tr>
         <w:tc>
           <w:tcPr>
-            <w:tcW w:type="dxa" w:w="1836"/>
-            <w:tcMar>
-              <w:top w:w="60" w:type="dxa"/>
-              <w:bottom w:w="60" w:type="dxa"/>
-              <w:left w:w="130" w:type="dxa"/>
-              <w:right w:w="130" w:type="dxa"/>
-            </w:tcMar>
-            <w:vAlign w:val="center"/>
+            <w:tcW w:type="dxa" w:w="1015"/>
             <w:tcBorders>
               <w:top w:val="nil"/>
               <w:left w:val="nil"/>
               <w:bottom w:val="single" w:sz="4" w:space="0" w:color="DCE0E6"/>
               <w:right w:val="nil"/>
             </w:tcBorders>
+            <w:tcMar>
+              <w:top w:w="60" w:type="dxa"/>
+              <w:left w:w="130" w:type="dxa"/>
+              <w:bottom w:w="60" w:type="dxa"/>
+              <w:right w:w="130" w:type="dxa"/>
+            </w:tcMar>
+            <w:vAlign w:val="center"/>
           </w:tcPr>
           <w:p>
             <w:pPr>
@@ -2168,20 +2152,20 @@
         </w:tc>
         <w:tc>
           <w:tcPr>
-            <w:tcW w:type="dxa" w:w="1836"/>
-            <w:tcMar>
-              <w:top w:w="60" w:type="dxa"/>
-              <w:bottom w:w="60" w:type="dxa"/>
-              <w:left w:w="130" w:type="dxa"/>
-              <w:right w:w="130" w:type="dxa"/>
-            </w:tcMar>
-            <w:vAlign w:val="center"/>
+            <w:tcW w:type="dxa" w:w="2114"/>
             <w:tcBorders>
               <w:top w:val="nil"/>
               <w:left w:val="nil"/>
               <w:bottom w:val="single" w:sz="4" w:space="0" w:color="DCE0E6"/>
               <w:right w:val="nil"/>
             </w:tcBorders>
+            <w:tcMar>
+              <w:top w:w="60" w:type="dxa"/>
+              <w:left w:w="130" w:type="dxa"/>
+              <w:bottom w:w="60" w:type="dxa"/>
+              <w:right w:w="130" w:type="dxa"/>
+            </w:tcMar>
+            <w:vAlign w:val="center"/>
           </w:tcPr>
           <w:p>
             <w:pPr>
@@ -2196,20 +2180,20 @@
         </w:tc>
         <w:tc>
           <w:tcPr>
-            <w:tcW w:type="dxa" w:w="1836"/>
-            <w:tcMar>
-              <w:top w:w="60" w:type="dxa"/>
-              <w:bottom w:w="60" w:type="dxa"/>
-              <w:left w:w="130" w:type="dxa"/>
-              <w:right w:w="130" w:type="dxa"/>
-            </w:tcMar>
-            <w:vAlign w:val="center"/>
+            <w:tcW w:type="dxa" w:w="1375"/>
             <w:tcBorders>
               <w:top w:val="nil"/>
               <w:left w:val="nil"/>
               <w:bottom w:val="single" w:sz="4" w:space="0" w:color="DCE0E6"/>
               <w:right w:val="nil"/>
             </w:tcBorders>
+            <w:tcMar>
+              <w:top w:w="60" w:type="dxa"/>
+              <w:left w:w="130" w:type="dxa"/>
+              <w:bottom w:w="60" w:type="dxa"/>
+              <w:right w:w="130" w:type="dxa"/>
+            </w:tcMar>
+            <w:vAlign w:val="center"/>
           </w:tcPr>
           <w:p>
             <w:pPr>
@@ -2224,20 +2208,20 @@
         </w:tc>
         <w:tc>
           <w:tcPr>
-            <w:tcW w:type="dxa" w:w="1836"/>
-            <w:tcMar>
-              <w:top w:w="60" w:type="dxa"/>
-              <w:bottom w:w="60" w:type="dxa"/>
-              <w:left w:w="130" w:type="dxa"/>
-              <w:right w:w="130" w:type="dxa"/>
-            </w:tcMar>
-            <w:vAlign w:val="center"/>
+            <w:tcW w:type="dxa" w:w="1311"/>
             <w:tcBorders>
               <w:top w:val="nil"/>
               <w:left w:val="nil"/>
               <w:bottom w:val="single" w:sz="4" w:space="0" w:color="DCE0E6"/>
               <w:right w:val="nil"/>
             </w:tcBorders>
+            <w:tcMar>
+              <w:top w:w="60" w:type="dxa"/>
+              <w:left w:w="130" w:type="dxa"/>
+              <w:bottom w:w="60" w:type="dxa"/>
+              <w:right w:w="130" w:type="dxa"/>
+            </w:tcMar>
+            <w:vAlign w:val="center"/>
           </w:tcPr>
           <w:p>
             <w:pPr>
@@ -2256,20 +2240,20 @@
         </w:tc>
         <w:tc>
           <w:tcPr>
-            <w:tcW w:type="dxa" w:w="1840"/>
-            <w:tcMar>
-              <w:top w:w="60" w:type="dxa"/>
-              <w:bottom w:w="60" w:type="dxa"/>
-              <w:left w:w="130" w:type="dxa"/>
-              <w:right w:w="130" w:type="dxa"/>
-            </w:tcMar>
-            <w:vAlign w:val="center"/>
+            <w:tcW w:type="dxa" w:w="3369"/>
             <w:tcBorders>
               <w:top w:val="nil"/>
               <w:left w:val="nil"/>
               <w:bottom w:val="single" w:sz="4" w:space="0" w:color="DCE0E6"/>
               <w:right w:val="nil"/>
             </w:tcBorders>
+            <w:tcMar>
+              <w:top w:w="60" w:type="dxa"/>
+              <w:left w:w="130" w:type="dxa"/>
+              <w:bottom w:w="60" w:type="dxa"/>
+              <w:right w:w="130" w:type="dxa"/>
+            </w:tcMar>
+            <w:vAlign w:val="center"/>
           </w:tcPr>
           <w:p>
             <w:pPr>
@@ -2286,14 +2270,7 @@
       <w:tr>
         <w:tc>
           <w:tcPr>
-            <w:tcW w:type="dxa" w:w="1836"/>
-            <w:tcMar>
-              <w:top w:w="60" w:type="dxa"/>
-              <w:bottom w:w="60" w:type="dxa"/>
-              <w:left w:w="130" w:type="dxa"/>
-              <w:right w:w="130" w:type="dxa"/>
-            </w:tcMar>
-            <w:vAlign w:val="center"/>
+            <w:tcW w:type="dxa" w:w="1015"/>
             <w:tcBorders>
               <w:top w:val="nil"/>
               <w:left w:val="nil"/>
@@ -2301,6 +2278,13 @@
               <w:right w:val="nil"/>
             </w:tcBorders>
             <w:shd w:val="clear" w:color="auto" w:fill="F5F7FA"/>
+            <w:tcMar>
+              <w:top w:w="60" w:type="dxa"/>
+              <w:left w:w="130" w:type="dxa"/>
+              <w:bottom w:w="60" w:type="dxa"/>
+              <w:right w:w="130" w:type="dxa"/>
+            </w:tcMar>
+            <w:vAlign w:val="center"/>
           </w:tcPr>
           <w:p>
             <w:pPr>
@@ -2315,14 +2299,7 @@
         </w:tc>
         <w:tc>
           <w:tcPr>
-            <w:tcW w:type="dxa" w:w="1836"/>
-            <w:tcMar>
-              <w:top w:w="60" w:type="dxa"/>
-              <w:bottom w:w="60" w:type="dxa"/>
-              <w:left w:w="130" w:type="dxa"/>
-              <w:right w:w="130" w:type="dxa"/>
-            </w:tcMar>
-            <w:vAlign w:val="center"/>
+            <w:tcW w:type="dxa" w:w="2114"/>
             <w:tcBorders>
               <w:top w:val="nil"/>
               <w:left w:val="nil"/>
@@ -2330,6 +2307,13 @@
               <w:right w:val="nil"/>
             </w:tcBorders>
             <w:shd w:val="clear" w:color="auto" w:fill="F5F7FA"/>
+            <w:tcMar>
+              <w:top w:w="60" w:type="dxa"/>
+              <w:left w:w="130" w:type="dxa"/>
+              <w:bottom w:w="60" w:type="dxa"/>
+              <w:right w:w="130" w:type="dxa"/>
+            </w:tcMar>
+            <w:vAlign w:val="center"/>
           </w:tcPr>
           <w:p>
             <w:pPr>
@@ -2344,14 +2328,7 @@
         </w:tc>
         <w:tc>
           <w:tcPr>
-            <w:tcW w:type="dxa" w:w="1836"/>
-            <w:tcMar>
-              <w:top w:w="60" w:type="dxa"/>
-              <w:bottom w:w="60" w:type="dxa"/>
-              <w:left w:w="130" w:type="dxa"/>
-              <w:right w:w="130" w:type="dxa"/>
-            </w:tcMar>
-            <w:vAlign w:val="center"/>
+            <w:tcW w:type="dxa" w:w="1375"/>
             <w:tcBorders>
               <w:top w:val="nil"/>
               <w:left w:val="nil"/>
@@ -2359,6 +2336,13 @@
               <w:right w:val="nil"/>
             </w:tcBorders>
             <w:shd w:val="clear" w:color="auto" w:fill="F5F7FA"/>
+            <w:tcMar>
+              <w:top w:w="60" w:type="dxa"/>
+              <w:left w:w="130" w:type="dxa"/>
+              <w:bottom w:w="60" w:type="dxa"/>
+              <w:right w:w="130" w:type="dxa"/>
+            </w:tcMar>
+            <w:vAlign w:val="center"/>
           </w:tcPr>
           <w:p>
             <w:pPr>
@@ -2373,14 +2357,7 @@
         </w:tc>
         <w:tc>
           <w:tcPr>
-            <w:tcW w:type="dxa" w:w="1836"/>
-            <w:tcMar>
-              <w:top w:w="60" w:type="dxa"/>
-              <w:bottom w:w="60" w:type="dxa"/>
-              <w:left w:w="130" w:type="dxa"/>
-              <w:right w:w="130" w:type="dxa"/>
-            </w:tcMar>
-            <w:vAlign w:val="center"/>
+            <w:tcW w:type="dxa" w:w="1311"/>
             <w:tcBorders>
               <w:top w:val="nil"/>
               <w:left w:val="nil"/>
@@ -2388,6 +2365,13 @@
               <w:right w:val="nil"/>
             </w:tcBorders>
             <w:shd w:val="clear" w:color="auto" w:fill="F5F7FA"/>
+            <w:tcMar>
+              <w:top w:w="60" w:type="dxa"/>
+              <w:left w:w="130" w:type="dxa"/>
+              <w:bottom w:w="60" w:type="dxa"/>
+              <w:right w:w="130" w:type="dxa"/>
+            </w:tcMar>
+            <w:vAlign w:val="center"/>
           </w:tcPr>
           <w:p>
             <w:pPr>
@@ -2402,14 +2386,7 @@
         </w:tc>
         <w:tc>
           <w:tcPr>
-            <w:tcW w:type="dxa" w:w="1840"/>
-            <w:tcMar>
-              <w:top w:w="60" w:type="dxa"/>
-              <w:bottom w:w="60" w:type="dxa"/>
-              <w:left w:w="130" w:type="dxa"/>
-              <w:right w:w="130" w:type="dxa"/>
-            </w:tcMar>
-            <w:vAlign w:val="center"/>
+            <w:tcW w:type="dxa" w:w="3369"/>
             <w:tcBorders>
               <w:top w:val="nil"/>
               <w:left w:val="nil"/>
@@ -2417,6 +2394,13 @@
               <w:right w:val="nil"/>
             </w:tcBorders>
             <w:shd w:val="clear" w:color="auto" w:fill="F5F7FA"/>
+            <w:tcMar>
+              <w:top w:w="60" w:type="dxa"/>
+              <w:left w:w="130" w:type="dxa"/>
+              <w:bottom w:w="60" w:type="dxa"/>
+              <w:right w:w="130" w:type="dxa"/>
+            </w:tcMar>
+            <w:vAlign w:val="center"/>
           </w:tcPr>
           <w:p>
             <w:pPr>
@@ -2454,17 +2438,17 @@
         <w:tc>
           <w:tcPr>
             <w:tcW w:type="dxa" w:w="9184"/>
-            <w:shd w:val="clear" w:color="auto" w:fill="FDECEA"/>
             <w:tcBorders>
               <w:top w:val="single" w:sz="4" w:space="0" w:color="FDECEA"/>
               <w:left w:val="single" w:sz="24" w:space="0" w:color="D32F2F"/>
               <w:bottom w:val="single" w:sz="4" w:space="0" w:color="FDECEA"/>
               <w:right w:val="single" w:sz="4" w:space="0" w:color="FDECEA"/>
             </w:tcBorders>
+            <w:shd w:val="clear" w:color="auto" w:fill="FDECEA"/>
             <w:tcMar>
               <w:top w:w="140" w:type="dxa"/>
+              <w:left w:w="200" w:type="dxa"/>
               <w:bottom w:w="140" w:type="dxa"/>
-              <w:left w:w="200" w:type="dxa"/>
               <w:right w:w="200" w:type="dxa"/>
             </w:tcMar>
           </w:tcPr>
@@ -2506,14 +2490,10 @@
               <w:rPr>
                 <w:b/>
               </w:rPr>
-              <w:t>3% of</w:t>
-              <w:br/>
-              <w:t>global turnover</w:t>
+              <w:t>3% of global turnover</w:t>
             </w:r>
             <w:r>
-              <w:t>. Phase 2 natively integrates transparency and model</w:t>
-              <w:br/>
-              <w:t>documentation requirements.</w:t>
+              <w:t>. Phase 2 natively integrates transparency and model documentation requirements.</w:t>
             </w:r>
           </w:p>
         </w:tc>
@@ -2521,11 +2501,11 @@
     </w:tbl>
     <w:p>
       <w:pPr>
-        <w:spacing w:before="200" w:after="120" w:line="307" w:lineRule="auto"/>
-        <w:ind w:left="680" w:right="454"/>
         <w:pBdr>
           <w:left w:val="single" w:sz="28" w:space="10" w:color="1B6B93"/>
         </w:pBdr>
+        <w:spacing w:before="200" w:after="120" w:line="307" w:lineRule="auto"/>
+        <w:ind w:left="680" w:right="454"/>
       </w:pPr>
       <w:r>
         <w:rPr>
@@ -2533,9 +2513,23 @@
           <w:color w:val="1A1A1A"/>
           <w:sz w:val="26"/>
         </w:rPr>
-        <w:t>“Digitalization is not a technology project — it is a change project that</w:t>
-        <w:br/>
-        <w:t>happens to use technology.”</w:t>
+        <w:t>“</w:t>
+      </w:r>
+      <w:r>
+        <w:rPr>
+          <w:i/>
+          <w:color w:val="1A1A1A"/>
+          <w:sz w:val="26"/>
+        </w:rPr>
+        <w:t>Digitalization is not a technology project — it is a change project that happens to use technology.</w:t>
+      </w:r>
+      <w:r>
+        <w:rPr>
+          <w:i/>
+          <w:color w:val="1A1A1A"/>
+          <w:sz w:val="26"/>
+        </w:rPr>
+        <w:t>”</w:t>
       </w:r>
     </w:p>
     <w:p>
@@ -2695,10 +2689,10 @@
         <w:tblLook w:firstColumn="1" w:firstRow="1" w:lastColumn="0" w:lastRow="0" w:noHBand="0" w:noVBand="1" w:val="04A0"/>
       </w:tblPr>
       <w:tblGrid>
-        <w:gridCol w:w="2296"/>
-        <w:gridCol w:w="2296"/>
-        <w:gridCol w:w="2296"/>
-        <w:gridCol w:w="2296"/>
+        <w:gridCol w:w="2435"/>
+        <w:gridCol w:w="1540"/>
+        <w:gridCol w:w="1540"/>
+        <w:gridCol w:w="3669"/>
       </w:tblGrid>
       <w:tr>
         <w:trPr>
@@ -2706,21 +2700,21 @@
         </w:trPr>
         <w:tc>
           <w:tcPr>
-            <w:tcW w:type="dxa" w:w="2296"/>
-            <w:tcMar>
-              <w:top w:w="70" w:type="dxa"/>
-              <w:bottom w:w="70" w:type="dxa"/>
-              <w:left w:w="130" w:type="dxa"/>
-              <w:right w:w="130" w:type="dxa"/>
-            </w:tcMar>
-            <w:vAlign w:val="center"/>
-            <w:shd w:val="clear" w:color="auto" w:fill="1B6B93"/>
+            <w:tcW w:type="dxa" w:w="2435"/>
             <w:tcBorders>
               <w:top w:val="nil"/>
               <w:left w:val="nil"/>
               <w:bottom w:val="single" w:sz="12" w:space="0" w:color="1B6B93"/>
               <w:right w:val="nil"/>
             </w:tcBorders>
+            <w:shd w:val="clear" w:color="auto" w:fill="1B6B93"/>
+            <w:tcMar>
+              <w:top w:w="70" w:type="dxa"/>
+              <w:left w:w="130" w:type="dxa"/>
+              <w:bottom w:w="70" w:type="dxa"/>
+              <w:right w:w="130" w:type="dxa"/>
+            </w:tcMar>
+            <w:vAlign w:val="center"/>
           </w:tcPr>
           <w:p>
             <w:pPr>
@@ -2740,21 +2734,21 @@
         </w:tc>
         <w:tc>
           <w:tcPr>
-            <w:tcW w:type="dxa" w:w="2296"/>
-            <w:tcMar>
-              <w:top w:w="70" w:type="dxa"/>
-              <w:bottom w:w="70" w:type="dxa"/>
-              <w:left w:w="130" w:type="dxa"/>
-              <w:right w:w="130" w:type="dxa"/>
-            </w:tcMar>
-            <w:vAlign w:val="center"/>
-            <w:shd w:val="clear" w:color="auto" w:fill="1B6B93"/>
+            <w:tcW w:type="dxa" w:w="1540"/>
             <w:tcBorders>
               <w:top w:val="nil"/>
               <w:left w:val="nil"/>
               <w:bottom w:val="single" w:sz="12" w:space="0" w:color="1B6B93"/>
               <w:right w:val="nil"/>
             </w:tcBorders>
+            <w:shd w:val="clear" w:color="auto" w:fill="1B6B93"/>
+            <w:tcMar>
+              <w:top w:w="70" w:type="dxa"/>
+              <w:left w:w="130" w:type="dxa"/>
+              <w:bottom w:w="70" w:type="dxa"/>
+              <w:right w:w="130" w:type="dxa"/>
+            </w:tcMar>
+            <w:vAlign w:val="center"/>
           </w:tcPr>
           <w:p>
             <w:pPr>
@@ -2774,21 +2768,21 @@
         </w:tc>
         <w:tc>
           <w:tcPr>
-            <w:tcW w:type="dxa" w:w="2296"/>
-            <w:tcMar>
-              <w:top w:w="70" w:type="dxa"/>
-              <w:bottom w:w="70" w:type="dxa"/>
-              <w:left w:w="130" w:type="dxa"/>
-              <w:right w:w="130" w:type="dxa"/>
-            </w:tcMar>
-            <w:vAlign w:val="center"/>
-            <w:shd w:val="clear" w:color="auto" w:fill="1B6B93"/>
+            <w:tcW w:type="dxa" w:w="1540"/>
             <w:tcBorders>
               <w:top w:val="nil"/>
               <w:left w:val="nil"/>
               <w:bottom w:val="single" w:sz="12" w:space="0" w:color="1B6B93"/>
               <w:right w:val="nil"/>
             </w:tcBorders>
+            <w:shd w:val="clear" w:color="auto" w:fill="1B6B93"/>
+            <w:tcMar>
+              <w:top w:w="70" w:type="dxa"/>
+              <w:left w:w="130" w:type="dxa"/>
+              <w:bottom w:w="70" w:type="dxa"/>
+              <w:right w:w="130" w:type="dxa"/>
+            </w:tcMar>
+            <w:vAlign w:val="center"/>
           </w:tcPr>
           <w:p>
             <w:pPr>
@@ -2808,21 +2802,21 @@
         </w:tc>
         <w:tc>
           <w:tcPr>
-            <w:tcW w:type="dxa" w:w="2296"/>
-            <w:tcMar>
-              <w:top w:w="70" w:type="dxa"/>
-              <w:bottom w:w="70" w:type="dxa"/>
-              <w:left w:w="130" w:type="dxa"/>
-              <w:right w:w="130" w:type="dxa"/>
-            </w:tcMar>
-            <w:vAlign w:val="center"/>
-            <w:shd w:val="clear" w:color="auto" w:fill="1B6B93"/>
+            <w:tcW w:type="dxa" w:w="3669"/>
             <w:tcBorders>
               <w:top w:val="nil"/>
               <w:left w:val="nil"/>
               <w:bottom w:val="single" w:sz="12" w:space="0" w:color="1B6B93"/>
               <w:right w:val="nil"/>
             </w:tcBorders>
+            <w:shd w:val="clear" w:color="auto" w:fill="1B6B93"/>
+            <w:tcMar>
+              <w:top w:w="70" w:type="dxa"/>
+              <w:left w:w="130" w:type="dxa"/>
+              <w:bottom w:w="70" w:type="dxa"/>
+              <w:right w:w="130" w:type="dxa"/>
+            </w:tcMar>
+            <w:vAlign w:val="center"/>
           </w:tcPr>
           <w:p>
             <w:pPr>
@@ -2844,20 +2838,20 @@
       <w:tr>
         <w:tc>
           <w:tcPr>
-            <w:tcW w:type="dxa" w:w="2296"/>
-            <w:tcMar>
-              <w:top w:w="60" w:type="dxa"/>
-              <w:bottom w:w="60" w:type="dxa"/>
-              <w:left w:w="130" w:type="dxa"/>
-              <w:right w:w="130" w:type="dxa"/>
-            </w:tcMar>
-            <w:vAlign w:val="center"/>
+            <w:tcW w:type="dxa" w:w="2435"/>
             <w:tcBorders>
               <w:top w:val="nil"/>
               <w:left w:val="nil"/>
               <w:bottom w:val="single" w:sz="4" w:space="0" w:color="DCE0E6"/>
               <w:right w:val="nil"/>
             </w:tcBorders>
+            <w:tcMar>
+              <w:top w:w="60" w:type="dxa"/>
+              <w:left w:w="130" w:type="dxa"/>
+              <w:bottom w:w="60" w:type="dxa"/>
+              <w:right w:w="130" w:type="dxa"/>
+            </w:tcMar>
+            <w:vAlign w:val="center"/>
           </w:tcPr>
           <w:p>
             <w:pPr>
@@ -2872,20 +2866,20 @@
         </w:tc>
         <w:tc>
           <w:tcPr>
-            <w:tcW w:type="dxa" w:w="2296"/>
-            <w:tcMar>
-              <w:top w:w="60" w:type="dxa"/>
-              <w:bottom w:w="60" w:type="dxa"/>
-              <w:left w:w="130" w:type="dxa"/>
-              <w:right w:w="130" w:type="dxa"/>
-            </w:tcMar>
-            <w:vAlign w:val="center"/>
+            <w:tcW w:type="dxa" w:w="1540"/>
             <w:tcBorders>
               <w:top w:val="nil"/>
               <w:left w:val="nil"/>
               <w:bottom w:val="single" w:sz="4" w:space="0" w:color="DCE0E6"/>
               <w:right w:val="nil"/>
             </w:tcBorders>
+            <w:tcMar>
+              <w:top w:w="60" w:type="dxa"/>
+              <w:left w:w="130" w:type="dxa"/>
+              <w:bottom w:w="60" w:type="dxa"/>
+              <w:right w:w="130" w:type="dxa"/>
+            </w:tcMar>
+            <w:vAlign w:val="center"/>
           </w:tcPr>
           <w:p>
             <w:pPr>
@@ -2900,20 +2894,20 @@
         </w:tc>
         <w:tc>
           <w:tcPr>
-            <w:tcW w:type="dxa" w:w="2296"/>
-            <w:tcMar>
-              <w:top w:w="60" w:type="dxa"/>
-              <w:bottom w:w="60" w:type="dxa"/>
-              <w:left w:w="130" w:type="dxa"/>
-              <w:right w:w="130" w:type="dxa"/>
-            </w:tcMar>
-            <w:vAlign w:val="center"/>
+            <w:tcW w:type="dxa" w:w="1540"/>
             <w:tcBorders>
               <w:top w:val="nil"/>
               <w:left w:val="nil"/>
               <w:bottom w:val="single" w:sz="4" w:space="0" w:color="DCE0E6"/>
               <w:right w:val="nil"/>
             </w:tcBorders>
+            <w:tcMar>
+              <w:top w:w="60" w:type="dxa"/>
+              <w:left w:w="130" w:type="dxa"/>
+              <w:bottom w:w="60" w:type="dxa"/>
+              <w:right w:w="130" w:type="dxa"/>
+            </w:tcMar>
+            <w:vAlign w:val="center"/>
           </w:tcPr>
           <w:p>
             <w:pPr>
@@ -2928,20 +2922,20 @@
         </w:tc>
         <w:tc>
           <w:tcPr>
-            <w:tcW w:type="dxa" w:w="2296"/>
-            <w:tcMar>
-              <w:top w:w="60" w:type="dxa"/>
-              <w:bottom w:w="60" w:type="dxa"/>
-              <w:left w:w="130" w:type="dxa"/>
-              <w:right w:w="130" w:type="dxa"/>
-            </w:tcMar>
-            <w:vAlign w:val="center"/>
+            <w:tcW w:type="dxa" w:w="3669"/>
             <w:tcBorders>
               <w:top w:val="nil"/>
               <w:left w:val="nil"/>
               <w:bottom w:val="single" w:sz="4" w:space="0" w:color="DCE0E6"/>
               <w:right w:val="nil"/>
             </w:tcBorders>
+            <w:tcMar>
+              <w:top w:w="60" w:type="dxa"/>
+              <w:left w:w="130" w:type="dxa"/>
+              <w:bottom w:w="60" w:type="dxa"/>
+              <w:right w:w="130" w:type="dxa"/>
+            </w:tcMar>
+            <w:vAlign w:val="center"/>
           </w:tcPr>
           <w:p>
             <w:pPr>
@@ -2958,14 +2952,7 @@
       <w:tr>
         <w:tc>
           <w:tcPr>
-            <w:tcW w:type="dxa" w:w="2296"/>
-            <w:tcMar>
-              <w:top w:w="60" w:type="dxa"/>
-              <w:bottom w:w="60" w:type="dxa"/>
-              <w:left w:w="130" w:type="dxa"/>
-              <w:right w:w="130" w:type="dxa"/>
-            </w:tcMar>
-            <w:vAlign w:val="center"/>
+            <w:tcW w:type="dxa" w:w="2435"/>
             <w:tcBorders>
               <w:top w:val="nil"/>
               <w:left w:val="nil"/>
@@ -2973,6 +2960,13 @@
               <w:right w:val="nil"/>
             </w:tcBorders>
             <w:shd w:val="clear" w:color="auto" w:fill="F5F7FA"/>
+            <w:tcMar>
+              <w:top w:w="60" w:type="dxa"/>
+              <w:left w:w="130" w:type="dxa"/>
+              <w:bottom w:w="60" w:type="dxa"/>
+              <w:right w:w="130" w:type="dxa"/>
+            </w:tcMar>
+            <w:vAlign w:val="center"/>
           </w:tcPr>
           <w:p>
             <w:pPr>
@@ -2987,14 +2981,7 @@
         </w:tc>
         <w:tc>
           <w:tcPr>
-            <w:tcW w:type="dxa" w:w="2296"/>
-            <w:tcMar>
-              <w:top w:w="60" w:type="dxa"/>
-              <w:bottom w:w="60" w:type="dxa"/>
-              <w:left w:w="130" w:type="dxa"/>
-              <w:right w:w="130" w:type="dxa"/>
-            </w:tcMar>
-            <w:vAlign w:val="center"/>
+            <w:tcW w:type="dxa" w:w="1540"/>
             <w:tcBorders>
               <w:top w:val="nil"/>
               <w:left w:val="nil"/>
@@ -3002,6 +2989,13 @@
               <w:right w:val="nil"/>
             </w:tcBorders>
             <w:shd w:val="clear" w:color="auto" w:fill="F5F7FA"/>
+            <w:tcMar>
+              <w:top w:w="60" w:type="dxa"/>
+              <w:left w:w="130" w:type="dxa"/>
+              <w:bottom w:w="60" w:type="dxa"/>
+              <w:right w:w="130" w:type="dxa"/>
+            </w:tcMar>
+            <w:vAlign w:val="center"/>
           </w:tcPr>
           <w:p>
             <w:pPr>
@@ -3016,14 +3010,7 @@
         </w:tc>
         <w:tc>
           <w:tcPr>
-            <w:tcW w:type="dxa" w:w="2296"/>
-            <w:tcMar>
-              <w:top w:w="60" w:type="dxa"/>
-              <w:bottom w:w="60" w:type="dxa"/>
-              <w:left w:w="130" w:type="dxa"/>
-              <w:right w:w="130" w:type="dxa"/>
-            </w:tcMar>
-            <w:vAlign w:val="center"/>
+            <w:tcW w:type="dxa" w:w="1540"/>
             <w:tcBorders>
               <w:top w:val="nil"/>
               <w:left w:val="nil"/>
@@ -3031,6 +3018,13 @@
               <w:right w:val="nil"/>
             </w:tcBorders>
             <w:shd w:val="clear" w:color="auto" w:fill="F5F7FA"/>
+            <w:tcMar>
+              <w:top w:w="60" w:type="dxa"/>
+              <w:left w:w="130" w:type="dxa"/>
+              <w:bottom w:w="60" w:type="dxa"/>
+              <w:right w:w="130" w:type="dxa"/>
+            </w:tcMar>
+            <w:vAlign w:val="center"/>
           </w:tcPr>
           <w:p>
             <w:pPr>
@@ -3045,14 +3039,7 @@
         </w:tc>
         <w:tc>
           <w:tcPr>
-            <w:tcW w:type="dxa" w:w="2296"/>
-            <w:tcMar>
-              <w:top w:w="60" w:type="dxa"/>
-              <w:bottom w:w="60" w:type="dxa"/>
-              <w:left w:w="130" w:type="dxa"/>
-              <w:right w:w="130" w:type="dxa"/>
-            </w:tcMar>
-            <w:vAlign w:val="center"/>
+            <w:tcW w:type="dxa" w:w="3669"/>
             <w:tcBorders>
               <w:top w:val="nil"/>
               <w:left w:val="nil"/>
@@ -3060,6 +3047,13 @@
               <w:right w:val="nil"/>
             </w:tcBorders>
             <w:shd w:val="clear" w:color="auto" w:fill="F5F7FA"/>
+            <w:tcMar>
+              <w:top w:w="60" w:type="dxa"/>
+              <w:left w:w="130" w:type="dxa"/>
+              <w:bottom w:w="60" w:type="dxa"/>
+              <w:right w:w="130" w:type="dxa"/>
+            </w:tcMar>
+            <w:vAlign w:val="center"/>
           </w:tcPr>
           <w:p>
             <w:pPr>
@@ -3076,20 +3070,20 @@
       <w:tr>
         <w:tc>
           <w:tcPr>
-            <w:tcW w:type="dxa" w:w="2296"/>
-            <w:tcMar>
-              <w:top w:w="60" w:type="dxa"/>
-              <w:bottom w:w="60" w:type="dxa"/>
-              <w:left w:w="130" w:type="dxa"/>
-              <w:right w:w="130" w:type="dxa"/>
-            </w:tcMar>
-            <w:vAlign w:val="center"/>
+            <w:tcW w:type="dxa" w:w="2435"/>
             <w:tcBorders>
               <w:top w:val="nil"/>
               <w:left w:val="nil"/>
               <w:bottom w:val="single" w:sz="4" w:space="0" w:color="DCE0E6"/>
               <w:right w:val="nil"/>
             </w:tcBorders>
+            <w:tcMar>
+              <w:top w:w="60" w:type="dxa"/>
+              <w:left w:w="130" w:type="dxa"/>
+              <w:bottom w:w="60" w:type="dxa"/>
+              <w:right w:w="130" w:type="dxa"/>
+            </w:tcMar>
+            <w:vAlign w:val="center"/>
           </w:tcPr>
           <w:p>
             <w:pPr>
@@ -3104,20 +3098,20 @@
         </w:tc>
         <w:tc>
           <w:tcPr>
-            <w:tcW w:type="dxa" w:w="2296"/>
-            <w:tcMar>
-              <w:top w:w="60" w:type="dxa"/>
-              <w:bottom w:w="60" w:type="dxa"/>
-              <w:left w:w="130" w:type="dxa"/>
-              <w:right w:w="130" w:type="dxa"/>
-            </w:tcMar>
-            <w:vAlign w:val="center"/>
+            <w:tcW w:type="dxa" w:w="1540"/>
             <w:tcBorders>
               <w:top w:val="nil"/>
               <w:left w:val="nil"/>
               <w:bottom w:val="single" w:sz="4" w:space="0" w:color="DCE0E6"/>
               <w:right w:val="nil"/>
             </w:tcBorders>
+            <w:tcMar>
+              <w:top w:w="60" w:type="dxa"/>
+              <w:left w:w="130" w:type="dxa"/>
+              <w:bottom w:w="60" w:type="dxa"/>
+              <w:right w:w="130" w:type="dxa"/>
+            </w:tcMar>
+            <w:vAlign w:val="center"/>
           </w:tcPr>
           <w:p>
             <w:pPr>
@@ -3132,20 +3126,20 @@
         </w:tc>
         <w:tc>
           <w:tcPr>
-            <w:tcW w:type="dxa" w:w="2296"/>
-            <w:tcMar>
-              <w:top w:w="60" w:type="dxa"/>
-              <w:bottom w:w="60" w:type="dxa"/>
-              <w:left w:w="130" w:type="dxa"/>
-              <w:right w:w="130" w:type="dxa"/>
-            </w:tcMar>
-            <w:vAlign w:val="center"/>
+            <w:tcW w:type="dxa" w:w="1540"/>
             <w:tcBorders>
               <w:top w:val="nil"/>
               <w:left w:val="nil"/>
               <w:bottom w:val="single" w:sz="4" w:space="0" w:color="DCE0E6"/>
               <w:right w:val="nil"/>
             </w:tcBorders>
+            <w:tcMar>
+              <w:top w:w="60" w:type="dxa"/>
+              <w:left w:w="130" w:type="dxa"/>
+              <w:bottom w:w="60" w:type="dxa"/>
+              <w:right w:w="130" w:type="dxa"/>
+            </w:tcMar>
+            <w:vAlign w:val="center"/>
           </w:tcPr>
           <w:p>
             <w:pPr>
@@ -3160,20 +3154,20 @@
         </w:tc>
         <w:tc>
           <w:tcPr>
-            <w:tcW w:type="dxa" w:w="2296"/>
-            <w:tcMar>
-              <w:top w:w="60" w:type="dxa"/>
-              <w:bottom w:w="60" w:type="dxa"/>
-              <w:left w:w="130" w:type="dxa"/>
-              <w:right w:w="130" w:type="dxa"/>
-            </w:tcMar>
-            <w:vAlign w:val="center"/>
+            <w:tcW w:type="dxa" w:w="3669"/>
             <w:tcBorders>
               <w:top w:val="nil"/>
               <w:left w:val="nil"/>
               <w:bottom w:val="single" w:sz="4" w:space="0" w:color="DCE0E6"/>
               <w:right w:val="nil"/>
             </w:tcBorders>
+            <w:tcMar>
+              <w:top w:w="60" w:type="dxa"/>
+              <w:left w:w="130" w:type="dxa"/>
+              <w:bottom w:w="60" w:type="dxa"/>
+              <w:right w:w="130" w:type="dxa"/>
+            </w:tcMar>
+            <w:vAlign w:val="center"/>
           </w:tcPr>
           <w:p>
             <w:pPr>
@@ -3190,14 +3184,7 @@
       <w:tr>
         <w:tc>
           <w:tcPr>
-            <w:tcW w:type="dxa" w:w="2296"/>
-            <w:tcMar>
-              <w:top w:w="60" w:type="dxa"/>
-              <w:bottom w:w="60" w:type="dxa"/>
-              <w:left w:w="130" w:type="dxa"/>
-              <w:right w:w="130" w:type="dxa"/>
-            </w:tcMar>
-            <w:vAlign w:val="center"/>
+            <w:tcW w:type="dxa" w:w="2435"/>
             <w:tcBorders>
               <w:top w:val="nil"/>
               <w:left w:val="nil"/>
@@ -3205,6 +3192,13 @@
               <w:right w:val="nil"/>
             </w:tcBorders>
             <w:shd w:val="clear" w:color="auto" w:fill="F5F7FA"/>
+            <w:tcMar>
+              <w:top w:w="60" w:type="dxa"/>
+              <w:left w:w="130" w:type="dxa"/>
+              <w:bottom w:w="60" w:type="dxa"/>
+              <w:right w:w="130" w:type="dxa"/>
+            </w:tcMar>
+            <w:vAlign w:val="center"/>
           </w:tcPr>
           <w:p>
             <w:pPr>
@@ -3219,14 +3213,7 @@
         </w:tc>
         <w:tc>
           <w:tcPr>
-            <w:tcW w:type="dxa" w:w="2296"/>
-            <w:tcMar>
-              <w:top w:w="60" w:type="dxa"/>
-              <w:bottom w:w="60" w:type="dxa"/>
-              <w:left w:w="130" w:type="dxa"/>
-              <w:right w:w="130" w:type="dxa"/>
-            </w:tcMar>
-            <w:vAlign w:val="center"/>
+            <w:tcW w:type="dxa" w:w="1540"/>
             <w:tcBorders>
               <w:top w:val="nil"/>
               <w:left w:val="nil"/>
@@ -3234,6 +3221,13 @@
               <w:right w:val="nil"/>
             </w:tcBorders>
             <w:shd w:val="clear" w:color="auto" w:fill="F5F7FA"/>
+            <w:tcMar>
+              <w:top w:w="60" w:type="dxa"/>
+              <w:left w:w="130" w:type="dxa"/>
+              <w:bottom w:w="60" w:type="dxa"/>
+              <w:right w:w="130" w:type="dxa"/>
+            </w:tcMar>
+            <w:vAlign w:val="center"/>
           </w:tcPr>
           <w:p>
             <w:pPr>
@@ -3248,14 +3242,7 @@
         </w:tc>
         <w:tc>
           <w:tcPr>
-            <w:tcW w:type="dxa" w:w="2296"/>
-            <w:tcMar>
-              <w:top w:w="60" w:type="dxa"/>
-              <w:bottom w:w="60" w:type="dxa"/>
-              <w:left w:w="130" w:type="dxa"/>
-              <w:right w:w="130" w:type="dxa"/>
-            </w:tcMar>
-            <w:vAlign w:val="center"/>
+            <w:tcW w:type="dxa" w:w="1540"/>
             <w:tcBorders>
               <w:top w:val="nil"/>
               <w:left w:val="nil"/>
@@ -3263,6 +3250,13 @@
               <w:right w:val="nil"/>
             </w:tcBorders>
             <w:shd w:val="clear" w:color="auto" w:fill="F5F7FA"/>
+            <w:tcMar>
+              <w:top w:w="60" w:type="dxa"/>
+              <w:left w:w="130" w:type="dxa"/>
+              <w:bottom w:w="60" w:type="dxa"/>
+              <w:right w:w="130" w:type="dxa"/>
+            </w:tcMar>
+            <w:vAlign w:val="center"/>
           </w:tcPr>
           <w:p>
             <w:pPr>
@@ -3277,14 +3271,7 @@
         </w:tc>
         <w:tc>
           <w:tcPr>
-            <w:tcW w:type="dxa" w:w="2296"/>
-            <w:tcMar>
-              <w:top w:w="60" w:type="dxa"/>
-              <w:bottom w:w="60" w:type="dxa"/>
-              <w:left w:w="130" w:type="dxa"/>
-              <w:right w:w="130" w:type="dxa"/>
-            </w:tcMar>
-            <w:vAlign w:val="center"/>
+            <w:tcW w:type="dxa" w:w="3669"/>
             <w:tcBorders>
               <w:top w:val="nil"/>
               <w:left w:val="nil"/>
@@ -3292,6 +3279,13 @@
               <w:right w:val="nil"/>
             </w:tcBorders>
             <w:shd w:val="clear" w:color="auto" w:fill="F5F7FA"/>
+            <w:tcMar>
+              <w:top w:w="60" w:type="dxa"/>
+              <w:left w:w="130" w:type="dxa"/>
+              <w:bottom w:w="60" w:type="dxa"/>
+              <w:right w:w="130" w:type="dxa"/>
+            </w:tcMar>
+            <w:vAlign w:val="center"/>
           </w:tcPr>
           <w:p>
             <w:pPr>
@@ -3344,17 +3338,17 @@
         <w:tc>
           <w:tcPr>
             <w:tcW w:type="dxa" w:w="9184"/>
-            <w:shd w:val="clear" w:color="auto" w:fill="E8F5E9"/>
             <w:tcBorders>
               <w:top w:val="single" w:sz="4" w:space="0" w:color="E8F5E9"/>
               <w:left w:val="single" w:sz="24" w:space="0" w:color="4CAF50"/>
               <w:bottom w:val="single" w:sz="4" w:space="0" w:color="E8F5E9"/>
               <w:right w:val="single" w:sz="4" w:space="0" w:color="E8F5E9"/>
             </w:tcBorders>
+            <w:shd w:val="clear" w:color="auto" w:fill="E8F5E9"/>
             <w:tcMar>
               <w:top w:w="140" w:type="dxa"/>
+              <w:left w:w="200" w:type="dxa"/>
               <w:bottom w:w="140" w:type="dxa"/>
-              <w:left w:w="200" w:type="dxa"/>
               <w:right w:w="200" w:type="dxa"/>
             </w:tcMar>
           </w:tcPr>
@@ -3399,9 +3393,7 @@
               <w:t>July 30, 2026</w:t>
             </w:r>
             <w:r>
-              <w:t xml:space="preserve"> to</w:t>
-              <w:br/>
-              <w:t>start work within Q3 2026, per plan.</w:t>
+              <w:t xml:space="preserve"> to start work within Q3 2026, per plan.</w:t>
             </w:r>
           </w:p>
         </w:tc>
@@ -3487,14 +3479,14 @@
   <w:p>
     <w:pPr>
       <w:pStyle w:val="Header"/>
+      <w:pBdr>
+        <w:bottom w:val="single" w:sz="4" w:space="1" w:color="A8C7D6"/>
+      </w:pBdr>
       <w:tabs>
         <w:tab w:pos="4592" w:val="center"/>
         <w:tab w:pos="9184" w:val="right"/>
       </w:tabs>
       <w:jc w:val="left"/>
-      <w:pBdr>
-        <w:bottom w:val="single" w:sz="4" w:space="1" w:color="A8C7D6"/>
-      </w:pBdr>
     </w:pPr>
     <w:r/>
     <w:r>

</xml_diff>